<commit_message>
Docs v1.1: explain microservices, monorepo-vs-monolith distinction
New sections 5.3-5.5: why seven microservices (scaling profiles,
failure isolation, independent deploys), why a monorepo does not
make the project monolithic, and a verifiable checklist of how
KnowVault meets the microservices definition. Glossary entries added.

Co-Authored-By: Claude Fable 5 <noreply@anthropic.com>
</commit_message>
<xml_diff>
--- a/docs/KnowVault-Project-Documentation.docx
+++ b/docs/KnowVault-Project-Documentation.docx
@@ -55,7 +55,7 @@
           <w:sz w:val="22"/>
           <w:szCs w:val="22"/>
         </w:rPr>
-        <w:t xml:space="preserve">Document version 1.0  |  8 July 2026  |  Covers work completed through the first Azure deployment</w:t>
+        <w:t xml:space="preserve">Document version 1.1  |  8 July 2026  |  Covers work completed through the first Azure deployment</w:t>
       </w:r>
     </w:p>
     <w:p>
@@ -2094,6 +2094,870 @@
       </w:tr>
     </w:tbl>
     <w:p>
+      <w:pPr>
+        <w:pStyle w:val="Heading2"/>
+      </w:pPr>
+      <w:r>
+        <w:t xml:space="preserve">5.3 Architecture style: what are microservices, and why do we use them?</w:t>
+      </w:r>
+    </w:p>
+    <w:p>
+      <w:pPr>
+        <w:spacing w:after="120"/>
+      </w:pPr>
+      <w:r>
+        <w:t xml:space="preserve">There are two broad ways to build a system like this:</w:t>
+      </w:r>
+    </w:p>
+    <w:p>
+      <w:pPr>
+        <w:pStyle w:val="ListParagraph"/>
+        <w:numPr>
+          <w:ilvl w:val="0"/>
+          <w:numId w:val="2"/>
+        </w:numPr>
+        <w:spacing w:after="60"/>
+      </w:pPr>
+      <w:r>
+        <w:rPr>
+          <w:b/>
+          <w:bCs/>
+        </w:rPr>
+        <w:t xml:space="preserve">A monolith: </w:t>
+      </w:r>
+      <w:r>
+        <w:t xml:space="preserve">one single large program that does everything — uploads, processing, search, answering — all in one running process. Like a restaurant where one person takes orders, cooks, serves, and washes dishes.</w:t>
+      </w:r>
+    </w:p>
+    <w:p>
+      <w:pPr>
+        <w:pStyle w:val="ListParagraph"/>
+        <w:numPr>
+          <w:ilvl w:val="0"/>
+          <w:numId w:val="2"/>
+        </w:numPr>
+        <w:spacing w:after="60"/>
+      </w:pPr>
+      <w:r>
+        <w:rPr>
+          <w:b/>
+          <w:bCs/>
+        </w:rPr>
+        <w:t xml:space="preserve">Microservices: </w:t>
+      </w:r>
+      <w:r>
+        <w:t xml:space="preserve">several small independent programs, each doing one job, cooperating over the network. Like a restaurant with a host, chefs, waiters, and a dishwasher — each specialized, each replaceable, each able to be added to independently when one station gets busy.</w:t>
+      </w:r>
+    </w:p>
+    <w:p>
+      <w:pPr>
+        <w:spacing w:after="120"/>
+      </w:pPr>
+      <w:r>
+        <w:t xml:space="preserve">KnowVault is built as </w:t>
+      </w:r>
+      <w:r>
+        <w:rPr>
+          <w:b/>
+          <w:bCs/>
+        </w:rPr>
+        <w:t xml:space="preserve">seven microservices</w:t>
+      </w:r>
+      <w:r>
+        <w:t xml:space="preserve">, and the reasons are practical, not fashionable:</w:t>
+      </w:r>
+    </w:p>
+    <w:p>
+      <w:pPr>
+        <w:pStyle w:val="ListParagraph"/>
+        <w:numPr>
+          <w:ilvl w:val="0"/>
+          <w:numId w:val="2"/>
+        </w:numPr>
+        <w:spacing w:after="60"/>
+      </w:pPr>
+      <w:r>
+        <w:rPr>
+          <w:b/>
+          <w:bCs/>
+        </w:rPr>
+        <w:t xml:space="preserve">Different parts have completely different workloads. </w:t>
+      </w:r>
+      <w:r>
+        <w:t xml:space="preserve">Document processing (Ingestion) happens in heavy bursts — imagine 500 documents arriving during an initial sync — while question-answering (Query/Answer) is a steady trickle all day. As separate services, each scales to its own demand: Ingestion can scale out to many copies during a burst and down to zero copies (costing nothing) when idle, while Query stays warm and responsive.</w:t>
+      </w:r>
+    </w:p>
+    <w:p>
+      <w:pPr>
+        <w:pStyle w:val="ListParagraph"/>
+        <w:numPr>
+          <w:ilvl w:val="0"/>
+          <w:numId w:val="2"/>
+        </w:numPr>
+        <w:spacing w:after="60"/>
+      </w:pPr>
+      <w:r>
+        <w:rPr>
+          <w:b/>
+          <w:bCs/>
+        </w:rPr>
+        <w:t xml:space="preserve">Failure isolation. </w:t>
+      </w:r>
+      <w:r>
+        <w:t xml:space="preserve">If document processing crashes on a malformed file, people asking questions notice nothing — the Answer service keeps running. In a monolith, one part misbehaving can take everything down.</w:t>
+      </w:r>
+    </w:p>
+    <w:p>
+      <w:pPr>
+        <w:pStyle w:val="ListParagraph"/>
+        <w:numPr>
+          <w:ilvl w:val="0"/>
+          <w:numId w:val="2"/>
+        </w:numPr>
+        <w:spacing w:after="60"/>
+      </w:pPr>
+      <w:r>
+        <w:rPr>
+          <w:b/>
+          <w:bCs/>
+        </w:rPr>
+        <w:t xml:space="preserve">Independent deployment. </w:t>
+      </w:r>
+      <w:r>
+        <w:t xml:space="preserve">A fix to the chunking logic ships by redeploying only Ingestion; the rest of the system is untouched. Smaller deployments mean smaller risk.</w:t>
+      </w:r>
+    </w:p>
+    <w:p>
+      <w:pPr>
+        <w:pStyle w:val="ListParagraph"/>
+        <w:numPr>
+          <w:ilvl w:val="0"/>
+          <w:numId w:val="2"/>
+        </w:numPr>
+        <w:spacing w:after="60"/>
+      </w:pPr>
+      <w:r>
+        <w:rPr>
+          <w:b/>
+          <w:bCs/>
+        </w:rPr>
+        <w:t xml:space="preserve">Clear ownership and testability. </w:t>
+      </w:r>
+      <w:r>
+        <w:t xml:space="preserve">Each service has one job and one reason to change — easier to understand, easier to test, easier to hand to a new developer.</w:t>
+      </w:r>
+    </w:p>
+    <w:p>
+      <w:pPr>
+        <w:spacing w:after="120"/>
+      </w:pPr>
+      <w:r>
+        <w:rPr>
+          <w:i/>
+          <w:iCs/>
+        </w:rPr>
+        <w:t xml:space="preserve">Honest trade-off: microservices add moving parts — network calls, queues, service discovery. Two choices keep that manageable here: .NET Aspire wires everything up automatically for local development, and Azure Container Apps does the same in the cloud. For a system with genuinely different workload shapes, the trade is worth it.</w:t>
+      </w:r>
+    </w:p>
+    <w:p>
+      <w:pPr>
+        <w:pStyle w:val="Heading2"/>
+      </w:pPr>
+      <w:r>
+        <w:t xml:space="preserve">5.4 Monorepo vs monolith — two different questions</w:t>
+      </w:r>
+    </w:p>
+    <w:p>
+      <w:pPr>
+        <w:spacing w:after="120"/>
+      </w:pPr>
+      <w:r>
+        <w:t xml:space="preserve">These two words sound similar and are often confused, but they answer </w:t>
+      </w:r>
+      <w:r>
+        <w:rPr>
+          <w:b/>
+          <w:bCs/>
+        </w:rPr>
+        <w:t xml:space="preserve">completely different questions</w:t>
+      </w:r>
+      <w:r>
+        <w:t xml:space="preserve">:</w:t>
+      </w:r>
+    </w:p>
+    <w:tbl>
+      <w:tblPr>
+        <w:tblW w:type="dxa" w:w="9360"/>
+        <w:tblBorders>
+          <w:top w:val="single" w:color="auto" w:sz="4"/>
+          <w:left w:val="single" w:color="auto" w:sz="4"/>
+          <w:bottom w:val="single" w:color="auto" w:sz="4"/>
+          <w:right w:val="single" w:color="auto" w:sz="4"/>
+          <w:insideH w:val="single" w:color="auto" w:sz="4"/>
+          <w:insideV w:val="single" w:color="auto" w:sz="4"/>
+        </w:tblBorders>
+      </w:tblPr>
+      <w:tblGrid>
+        <w:gridCol w:w="2200"/>
+        <w:gridCol w:w="3580"/>
+        <w:gridCol w:w="3580"/>
+      </w:tblGrid>
+      <w:tr>
+        <w:trPr>
+          <w:tblHeader/>
+        </w:trPr>
+        <w:tc>
+          <w:tcPr>
+            <w:tcW w:type="dxa" w:w="2200"/>
+            <w:tcBorders>
+              <w:top w:val="single" w:color="BBBBBB" w:sz="1"/>
+              <w:left w:val="single" w:color="BBBBBB" w:sz="1"/>
+              <w:bottom w:val="single" w:color="BBBBBB" w:sz="1"/>
+              <w:right w:val="single" w:color="BBBBBB" w:sz="1"/>
+            </w:tcBorders>
+            <w:shd w:fill="D5E8F0" w:val="clear"/>
+            <w:tcMar>
+              <w:top w:type="dxa" w:w="80"/>
+              <w:left w:type="dxa" w:w="120"/>
+              <w:bottom w:type="dxa" w:w="80"/>
+              <w:right w:type="dxa" w:w="120"/>
+            </w:tcMar>
+          </w:tcPr>
+          <w:p>
+            <w:r>
+              <w:rPr>
+                <w:b/>
+                <w:bCs/>
+                <w:sz w:val="20"/>
+                <w:szCs w:val="20"/>
+              </w:rPr>
+              <w:t xml:space="preserve"/>
+            </w:r>
+          </w:p>
+        </w:tc>
+        <w:tc>
+          <w:tcPr>
+            <w:tcW w:type="dxa" w:w="3580"/>
+            <w:tcBorders>
+              <w:top w:val="single" w:color="BBBBBB" w:sz="1"/>
+              <w:left w:val="single" w:color="BBBBBB" w:sz="1"/>
+              <w:bottom w:val="single" w:color="BBBBBB" w:sz="1"/>
+              <w:right w:val="single" w:color="BBBBBB" w:sz="1"/>
+            </w:tcBorders>
+            <w:shd w:fill="D5E8F0" w:val="clear"/>
+            <w:tcMar>
+              <w:top w:type="dxa" w:w="80"/>
+              <w:left w:type="dxa" w:w="120"/>
+              <w:bottom w:type="dxa" w:w="80"/>
+              <w:right w:type="dxa" w:w="120"/>
+            </w:tcMar>
+          </w:tcPr>
+          <w:p>
+            <w:r>
+              <w:rPr>
+                <w:b/>
+                <w:bCs/>
+                <w:sz w:val="20"/>
+                <w:szCs w:val="20"/>
+              </w:rPr>
+              <w:t xml:space="preserve">Monorepo</w:t>
+            </w:r>
+          </w:p>
+        </w:tc>
+        <w:tc>
+          <w:tcPr>
+            <w:tcW w:type="dxa" w:w="3580"/>
+            <w:tcBorders>
+              <w:top w:val="single" w:color="BBBBBB" w:sz="1"/>
+              <w:left w:val="single" w:color="BBBBBB" w:sz="1"/>
+              <w:bottom w:val="single" w:color="BBBBBB" w:sz="1"/>
+              <w:right w:val="single" w:color="BBBBBB" w:sz="1"/>
+            </w:tcBorders>
+            <w:shd w:fill="D5E8F0" w:val="clear"/>
+            <w:tcMar>
+              <w:top w:type="dxa" w:w="80"/>
+              <w:left w:type="dxa" w:w="120"/>
+              <w:bottom w:type="dxa" w:w="80"/>
+              <w:right w:type="dxa" w:w="120"/>
+            </w:tcMar>
+          </w:tcPr>
+          <w:p>
+            <w:r>
+              <w:rPr>
+                <w:b/>
+                <w:bCs/>
+                <w:sz w:val="20"/>
+                <w:szCs w:val="20"/>
+              </w:rPr>
+              <w:t xml:space="preserve">Monolith</w:t>
+            </w:r>
+          </w:p>
+        </w:tc>
+      </w:tr>
+      <w:tr>
+        <w:tc>
+          <w:tcPr>
+            <w:tcW w:type="dxa" w:w="2200"/>
+            <w:tcBorders>
+              <w:top w:val="single" w:color="BBBBBB" w:sz="1"/>
+              <w:left w:val="single" w:color="BBBBBB" w:sz="1"/>
+              <w:bottom w:val="single" w:color="BBBBBB" w:sz="1"/>
+              <w:right w:val="single" w:color="BBBBBB" w:sz="1"/>
+            </w:tcBorders>
+            <w:tcMar>
+              <w:top w:type="dxa" w:w="80"/>
+              <w:left w:type="dxa" w:w="120"/>
+              <w:bottom w:type="dxa" w:w="80"/>
+              <w:right w:type="dxa" w:w="120"/>
+            </w:tcMar>
+          </w:tcPr>
+          <w:p>
+            <w:r>
+              <w:rPr>
+                <w:sz w:val="20"/>
+                <w:szCs w:val="20"/>
+              </w:rPr>
+              <w:t xml:space="preserve">The question it answers</w:t>
+            </w:r>
+          </w:p>
+        </w:tc>
+        <w:tc>
+          <w:tcPr>
+            <w:tcW w:type="dxa" w:w="3580"/>
+            <w:tcBorders>
+              <w:top w:val="single" w:color="BBBBBB" w:sz="1"/>
+              <w:left w:val="single" w:color="BBBBBB" w:sz="1"/>
+              <w:bottom w:val="single" w:color="BBBBBB" w:sz="1"/>
+              <w:right w:val="single" w:color="BBBBBB" w:sz="1"/>
+            </w:tcBorders>
+            <w:tcMar>
+              <w:top w:type="dxa" w:w="80"/>
+              <w:left w:type="dxa" w:w="120"/>
+              <w:bottom w:type="dxa" w:w="80"/>
+              <w:right w:type="dxa" w:w="120"/>
+            </w:tcMar>
+          </w:tcPr>
+          <w:p>
+            <w:r>
+              <w:rPr>
+                <w:sz w:val="20"/>
+                <w:szCs w:val="20"/>
+              </w:rPr>
+              <w:t xml:space="preserve">Where does the source code LIVE?</w:t>
+            </w:r>
+          </w:p>
+        </w:tc>
+        <w:tc>
+          <w:tcPr>
+            <w:tcW w:type="dxa" w:w="3580"/>
+            <w:tcBorders>
+              <w:top w:val="single" w:color="BBBBBB" w:sz="1"/>
+              <w:left w:val="single" w:color="BBBBBB" w:sz="1"/>
+              <w:bottom w:val="single" w:color="BBBBBB" w:sz="1"/>
+              <w:right w:val="single" w:color="BBBBBB" w:sz="1"/>
+            </w:tcBorders>
+            <w:tcMar>
+              <w:top w:type="dxa" w:w="80"/>
+              <w:left w:type="dxa" w:w="120"/>
+              <w:bottom w:type="dxa" w:w="80"/>
+              <w:right w:type="dxa" w:w="120"/>
+            </w:tcMar>
+          </w:tcPr>
+          <w:p>
+            <w:r>
+              <w:rPr>
+                <w:sz w:val="20"/>
+                <w:szCs w:val="20"/>
+              </w:rPr>
+              <w:t xml:space="preserve">How does the system RUN?</w:t>
+            </w:r>
+          </w:p>
+        </w:tc>
+      </w:tr>
+      <w:tr>
+        <w:tc>
+          <w:tcPr>
+            <w:tcW w:type="dxa" w:w="2200"/>
+            <w:tcBorders>
+              <w:top w:val="single" w:color="BBBBBB" w:sz="1"/>
+              <w:left w:val="single" w:color="BBBBBB" w:sz="1"/>
+              <w:bottom w:val="single" w:color="BBBBBB" w:sz="1"/>
+              <w:right w:val="single" w:color="BBBBBB" w:sz="1"/>
+            </w:tcBorders>
+            <w:tcMar>
+              <w:top w:type="dxa" w:w="80"/>
+              <w:left w:type="dxa" w:w="120"/>
+              <w:bottom w:type="dxa" w:w="80"/>
+              <w:right w:type="dxa" w:w="120"/>
+            </w:tcMar>
+          </w:tcPr>
+          <w:p>
+            <w:r>
+              <w:rPr>
+                <w:sz w:val="20"/>
+                <w:szCs w:val="20"/>
+              </w:rPr>
+              <w:t xml:space="preserve">What it means</w:t>
+            </w:r>
+          </w:p>
+        </w:tc>
+        <w:tc>
+          <w:tcPr>
+            <w:tcW w:type="dxa" w:w="3580"/>
+            <w:tcBorders>
+              <w:top w:val="single" w:color="BBBBBB" w:sz="1"/>
+              <w:left w:val="single" w:color="BBBBBB" w:sz="1"/>
+              <w:bottom w:val="single" w:color="BBBBBB" w:sz="1"/>
+              <w:right w:val="single" w:color="BBBBBB" w:sz="1"/>
+            </w:tcBorders>
+            <w:tcMar>
+              <w:top w:type="dxa" w:w="80"/>
+              <w:left w:type="dxa" w:w="120"/>
+              <w:bottom w:type="dxa" w:w="80"/>
+              <w:right w:type="dxa" w:w="120"/>
+            </w:tcMar>
+          </w:tcPr>
+          <w:p>
+            <w:r>
+              <w:rPr>
+                <w:sz w:val="20"/>
+                <w:szCs w:val="20"/>
+              </w:rPr>
+              <w:t xml:space="preserve">All code in one repository (one folder tree, one git history)</w:t>
+            </w:r>
+          </w:p>
+        </w:tc>
+        <w:tc>
+          <w:tcPr>
+            <w:tcW w:type="dxa" w:w="3580"/>
+            <w:tcBorders>
+              <w:top w:val="single" w:color="BBBBBB" w:sz="1"/>
+              <w:left w:val="single" w:color="BBBBBB" w:sz="1"/>
+              <w:bottom w:val="single" w:color="BBBBBB" w:sz="1"/>
+              <w:right w:val="single" w:color="BBBBBB" w:sz="1"/>
+            </w:tcBorders>
+            <w:tcMar>
+              <w:top w:type="dxa" w:w="80"/>
+              <w:left w:type="dxa" w:w="120"/>
+              <w:bottom w:type="dxa" w:w="80"/>
+              <w:right w:type="dxa" w:w="120"/>
+            </w:tcMar>
+          </w:tcPr>
+          <w:p>
+            <w:r>
+              <w:rPr>
+                <w:sz w:val="20"/>
+                <w:szCs w:val="20"/>
+              </w:rPr>
+              <w:t xml:space="preserve">All functionality in one single running program</w:t>
+            </w:r>
+          </w:p>
+        </w:tc>
+      </w:tr>
+      <w:tr>
+        <w:tc>
+          <w:tcPr>
+            <w:tcW w:type="dxa" w:w="2200"/>
+            <w:tcBorders>
+              <w:top w:val="single" w:color="BBBBBB" w:sz="1"/>
+              <w:left w:val="single" w:color="BBBBBB" w:sz="1"/>
+              <w:bottom w:val="single" w:color="BBBBBB" w:sz="1"/>
+              <w:right w:val="single" w:color="BBBBBB" w:sz="1"/>
+            </w:tcBorders>
+            <w:tcMar>
+              <w:top w:type="dxa" w:w="80"/>
+              <w:left w:type="dxa" w:w="120"/>
+              <w:bottom w:type="dxa" w:w="80"/>
+              <w:right w:type="dxa" w:w="120"/>
+            </w:tcMar>
+          </w:tcPr>
+          <w:p>
+            <w:r>
+              <w:rPr>
+                <w:sz w:val="20"/>
+                <w:szCs w:val="20"/>
+              </w:rPr>
+              <w:t xml:space="preserve">What it is</w:t>
+            </w:r>
+          </w:p>
+        </w:tc>
+        <w:tc>
+          <w:tcPr>
+            <w:tcW w:type="dxa" w:w="3580"/>
+            <w:tcBorders>
+              <w:top w:val="single" w:color="BBBBBB" w:sz="1"/>
+              <w:left w:val="single" w:color="BBBBBB" w:sz="1"/>
+              <w:bottom w:val="single" w:color="BBBBBB" w:sz="1"/>
+              <w:right w:val="single" w:color="BBBBBB" w:sz="1"/>
+            </w:tcBorders>
+            <w:tcMar>
+              <w:top w:type="dxa" w:w="80"/>
+              <w:left w:type="dxa" w:w="120"/>
+              <w:bottom w:type="dxa" w:w="80"/>
+              <w:right w:type="dxa" w:w="120"/>
+            </w:tcMar>
+          </w:tcPr>
+          <w:p>
+            <w:r>
+              <w:rPr>
+                <w:sz w:val="20"/>
+                <w:szCs w:val="20"/>
+              </w:rPr>
+              <w:t xml:space="preserve">A filing / organization decision</w:t>
+            </w:r>
+          </w:p>
+        </w:tc>
+        <w:tc>
+          <w:tcPr>
+            <w:tcW w:type="dxa" w:w="3580"/>
+            <w:tcBorders>
+              <w:top w:val="single" w:color="BBBBBB" w:sz="1"/>
+              <w:left w:val="single" w:color="BBBBBB" w:sz="1"/>
+              <w:bottom w:val="single" w:color="BBBBBB" w:sz="1"/>
+              <w:right w:val="single" w:color="BBBBBB" w:sz="1"/>
+            </w:tcBorders>
+            <w:tcMar>
+              <w:top w:type="dxa" w:w="80"/>
+              <w:left w:type="dxa" w:w="120"/>
+              <w:bottom w:type="dxa" w:w="80"/>
+              <w:right w:type="dxa" w:w="120"/>
+            </w:tcMar>
+          </w:tcPr>
+          <w:p>
+            <w:r>
+              <w:rPr>
+                <w:sz w:val="20"/>
+                <w:szCs w:val="20"/>
+              </w:rPr>
+              <w:t xml:space="preserve">An architecture decision</w:t>
+            </w:r>
+          </w:p>
+        </w:tc>
+      </w:tr>
+      <w:tr>
+        <w:tc>
+          <w:tcPr>
+            <w:tcW w:type="dxa" w:w="2200"/>
+            <w:tcBorders>
+              <w:top w:val="single" w:color="BBBBBB" w:sz="1"/>
+              <w:left w:val="single" w:color="BBBBBB" w:sz="1"/>
+              <w:bottom w:val="single" w:color="BBBBBB" w:sz="1"/>
+              <w:right w:val="single" w:color="BBBBBB" w:sz="1"/>
+            </w:tcBorders>
+            <w:tcMar>
+              <w:top w:type="dxa" w:w="80"/>
+              <w:left w:type="dxa" w:w="120"/>
+              <w:bottom w:type="dxa" w:w="80"/>
+              <w:right w:type="dxa" w:w="120"/>
+            </w:tcMar>
+          </w:tcPr>
+          <w:p>
+            <w:r>
+              <w:rPr>
+                <w:sz w:val="20"/>
+                <w:szCs w:val="20"/>
+              </w:rPr>
+              <w:t xml:space="preserve">KnowVault's choice</w:t>
+            </w:r>
+          </w:p>
+        </w:tc>
+        <w:tc>
+          <w:tcPr>
+            <w:tcW w:type="dxa" w:w="3580"/>
+            <w:tcBorders>
+              <w:top w:val="single" w:color="BBBBBB" w:sz="1"/>
+              <w:left w:val="single" w:color="BBBBBB" w:sz="1"/>
+              <w:bottom w:val="single" w:color="BBBBBB" w:sz="1"/>
+              <w:right w:val="single" w:color="BBBBBB" w:sz="1"/>
+            </w:tcBorders>
+            <w:tcMar>
+              <w:top w:type="dxa" w:w="80"/>
+              <w:left w:type="dxa" w:w="120"/>
+              <w:bottom w:type="dxa" w:w="80"/>
+              <w:right w:type="dxa" w:w="120"/>
+            </w:tcMar>
+          </w:tcPr>
+          <w:p>
+            <w:r>
+              <w:rPr>
+                <w:sz w:val="20"/>
+                <w:szCs w:val="20"/>
+              </w:rPr>
+              <w:t xml:space="preserve">YES — one repository</w:t>
+            </w:r>
+          </w:p>
+        </w:tc>
+        <w:tc>
+          <w:tcPr>
+            <w:tcW w:type="dxa" w:w="3580"/>
+            <w:tcBorders>
+              <w:top w:val="single" w:color="BBBBBB" w:sz="1"/>
+              <w:left w:val="single" w:color="BBBBBB" w:sz="1"/>
+              <w:bottom w:val="single" w:color="BBBBBB" w:sz="1"/>
+              <w:right w:val="single" w:color="BBBBBB" w:sz="1"/>
+            </w:tcBorders>
+            <w:tcMar>
+              <w:top w:type="dxa" w:w="80"/>
+              <w:left w:type="dxa" w:w="120"/>
+              <w:bottom w:type="dxa" w:w="80"/>
+              <w:right w:type="dxa" w:w="120"/>
+            </w:tcMar>
+          </w:tcPr>
+          <w:p>
+            <w:r>
+              <w:rPr>
+                <w:sz w:val="20"/>
+                <w:szCs w:val="20"/>
+              </w:rPr>
+              <w:t xml:space="preserve">NO — seven independent services</w:t>
+            </w:r>
+          </w:p>
+        </w:tc>
+      </w:tr>
+    </w:tbl>
+    <w:p>
+      <w:pPr>
+        <w:spacing w:after="120"/>
+      </w:pPr>
+      <w:r>
+        <w:t xml:space="preserve"/>
+      </w:r>
+    </w:p>
+    <w:p>
+      <w:pPr>
+        <w:spacing w:after="120"/>
+      </w:pPr>
+      <w:r>
+        <w:t xml:space="preserve">So: </w:t>
+      </w:r>
+      <w:r>
+        <w:rPr>
+          <w:b/>
+          <w:bCs/>
+        </w:rPr>
+        <w:t xml:space="preserve">KnowVault is a monorepo of microservices — and a monorepo does NOT make a project monolithic.</w:t>
+      </w:r>
+      <w:r>
+        <w:t xml:space="preserve"> The repository is just the filing cabinet; what matters architecturally is that seven separate programs come out of it, each running, scaling, and failing independently.</w:t>
+      </w:r>
+    </w:p>
+    <w:p>
+      <w:pPr>
+        <w:spacing w:after="120"/>
+      </w:pPr>
+      <w:r>
+        <w:t xml:space="preserve">Why one repository, then? (Recorded as ADR-003.) For a project like this it is the professional default:</w:t>
+      </w:r>
+    </w:p>
+    <w:p>
+      <w:pPr>
+        <w:pStyle w:val="ListParagraph"/>
+        <w:numPr>
+          <w:ilvl w:val="0"/>
+          <w:numId w:val="2"/>
+        </w:numPr>
+        <w:spacing w:after="60"/>
+      </w:pPr>
+      <w:r>
+        <w:rPr>
+          <w:b/>
+          <w:bCs/>
+        </w:rPr>
+        <w:t xml:space="preserve">Atomic changes: </w:t>
+      </w:r>
+      <w:r>
+        <w:t xml:space="preserve">when a message format changes, the sender (Admin), the receiver (Ingestion), and the contract definition all change together in one reviewable commit — no risk of the pieces getting out of sync across repositories.</w:t>
+      </w:r>
+    </w:p>
+    <w:p>
+      <w:pPr>
+        <w:pStyle w:val="ListParagraph"/>
+        <w:numPr>
+          <w:ilvl w:val="0"/>
+          <w:numId w:val="2"/>
+        </w:numPr>
+        <w:spacing w:after="60"/>
+      </w:pPr>
+      <w:r>
+        <w:rPr>
+          <w:b/>
+          <w:bCs/>
+        </w:rPr>
+        <w:t xml:space="preserve">One CI pipeline, one place for tests, decisions, and documentation </w:t>
+      </w:r>
+      <w:r>
+        <w:t xml:space="preserve">— instead of maintaining seven copies.</w:t>
+      </w:r>
+    </w:p>
+    <w:p>
+      <w:pPr>
+        <w:pStyle w:val="ListParagraph"/>
+        <w:numPr>
+          <w:ilvl w:val="0"/>
+          <w:numId w:val="2"/>
+        </w:numPr>
+        <w:spacing w:after="60"/>
+      </w:pPr>
+      <w:r>
+        <w:rPr>
+          <w:b/>
+          <w:bCs/>
+        </w:rPr>
+        <w:t xml:space="preserve">Shared code without publishing packages: </w:t>
+      </w:r>
+      <w:r>
+        <w:t xml:space="preserve">the Domain and Contracts libraries are referenced directly by the services that need them. With separate repositories we would need an internal package feed just to share them.</w:t>
+      </w:r>
+    </w:p>
+    <w:p>
+      <w:pPr>
+        <w:pStyle w:val="ListParagraph"/>
+        <w:numPr>
+          <w:ilvl w:val="0"/>
+          <w:numId w:val="2"/>
+        </w:numPr>
+        <w:spacing w:after="60"/>
+      </w:pPr>
+      <w:r>
+        <w:rPr>
+          <w:b/>
+          <w:bCs/>
+        </w:rPr>
+        <w:t xml:space="preserve">Right-sized for the team: </w:t>
+      </w:r>
+      <w:r>
+        <w:t xml:space="preserve">companies like Google and Microsoft run monorepos with thousands of engineers; for a solo project it removes overhead with no downside. If the team grew, the folder layout maps one-to-one onto separate repositories.</w:t>
+      </w:r>
+    </w:p>
+    <w:p>
+      <w:pPr>
+        <w:pStyle w:val="Heading2"/>
+      </w:pPr>
+      <w:r>
+        <w:t xml:space="preserve">5.5 The proof: how exactly is KnowVault microservices?</w:t>
+      </w:r>
+    </w:p>
+    <w:p>
+      <w:pPr>
+        <w:spacing w:after="120"/>
+      </w:pPr>
+      <w:r>
+        <w:t xml:space="preserve">A checklist a reviewer can verify against the code and the running system:</w:t>
+      </w:r>
+    </w:p>
+    <w:p>
+      <w:pPr>
+        <w:pStyle w:val="ListParagraph"/>
+        <w:numPr>
+          <w:ilvl w:val="0"/>
+          <w:numId w:val="2"/>
+        </w:numPr>
+        <w:spacing w:after="60"/>
+      </w:pPr>
+      <w:r>
+        <w:rPr>
+          <w:b/>
+          <w:bCs/>
+        </w:rPr>
+        <w:t xml:space="preserve">Separate processes: </w:t>
+      </w:r>
+      <w:r>
+        <w:t xml:space="preserve">each of the seven services is its own executable project with its own Program.cs, running as its own process locally and as its own container in Azure Container Apps. There is no single 'KnowVault.exe'.</w:t>
+      </w:r>
+    </w:p>
+    <w:p>
+      <w:pPr>
+        <w:pStyle w:val="ListParagraph"/>
+        <w:numPr>
+          <w:ilvl w:val="0"/>
+          <w:numId w:val="2"/>
+        </w:numPr>
+        <w:spacing w:after="60"/>
+      </w:pPr>
+      <w:r>
+        <w:rPr>
+          <w:b/>
+          <w:bCs/>
+        </w:rPr>
+        <w:t xml:space="preserve">Communication only over the network: </w:t>
+      </w:r>
+      <w:r>
+        <w:t xml:space="preserve">services talk through HTTP calls and Service Bus queue messages — never by calling each other's code directly or sharing memory. Admin does not 'call' Ingestion; it drops a message in a queue, and Ingestion — possibly minutes later, possibly a different machine — picks it up.</w:t>
+      </w:r>
+    </w:p>
+    <w:p>
+      <w:pPr>
+        <w:pStyle w:val="ListParagraph"/>
+        <w:numPr>
+          <w:ilvl w:val="0"/>
+          <w:numId w:val="2"/>
+        </w:numPr>
+        <w:spacing w:after="60"/>
+      </w:pPr>
+      <w:r>
+        <w:rPr>
+          <w:b/>
+          <w:bCs/>
+        </w:rPr>
+        <w:t xml:space="preserve">Independent scaling: </w:t>
+      </w:r>
+      <w:r>
+        <w:t xml:space="preserve">the Container Apps configuration gives each service its own scaling rules — Ingestion scales on queue depth (including to zero), Query/Answer on request load.</w:t>
+      </w:r>
+    </w:p>
+    <w:p>
+      <w:pPr>
+        <w:pStyle w:val="ListParagraph"/>
+        <w:numPr>
+          <w:ilvl w:val="0"/>
+          <w:numId w:val="2"/>
+        </w:numPr>
+        <w:spacing w:after="60"/>
+      </w:pPr>
+      <w:r>
+        <w:rPr>
+          <w:b/>
+          <w:bCs/>
+        </w:rPr>
+        <w:t xml:space="preserve">Independent failure: </w:t>
+      </w:r>
+      <w:r>
+        <w:t xml:space="preserve">a poisoned document dead-letters inside Ingestion's queue without touching any other service.</w:t>
+      </w:r>
+    </w:p>
+    <w:p>
+      <w:pPr>
+        <w:pStyle w:val="ListParagraph"/>
+        <w:numPr>
+          <w:ilvl w:val="0"/>
+          <w:numId w:val="2"/>
+        </w:numPr>
+        <w:spacing w:after="60"/>
+      </w:pPr>
+      <w:r>
+        <w:rPr>
+          <w:b/>
+          <w:bCs/>
+        </w:rPr>
+        <w:t xml:space="preserve">Single responsibility each: </w:t>
+      </w:r>
+      <w:r>
+        <w:t xml:space="preserve">the one-line-per-service table in 5.2 is genuinely one line per service — none of them does two jobs.</w:t>
+      </w:r>
+    </w:p>
+    <w:p>
+      <w:pPr>
+        <w:spacing w:after="120"/>
+      </w:pPr>
+      <w:r>
+        <w:rPr>
+          <w:i/>
+          <w:iCs/>
+        </w:rPr>
+        <w:t xml:space="preserve">One pragmatic softening, standard in monorepos: services share two compiled libraries (Domain and Contracts) at build time. That is code reuse, not runtime coupling — at run time the seven services remain fully independent.</w:t>
+      </w:r>
+    </w:p>
+    <w:p>
       <w:r>
         <w:br w:type="page"/>
       </w:r>
@@ -9652,6 +10516,168 @@
                 <w:szCs w:val="20"/>
               </w:rPr>
               <w:t xml:space="preserve">Meaning</w:t>
+            </w:r>
+          </w:p>
+        </w:tc>
+      </w:tr>
+      <w:tr>
+        <w:tc>
+          <w:tcPr>
+            <w:tcW w:type="dxa" w:w="2600"/>
+            <w:tcBorders>
+              <w:top w:val="single" w:color="BBBBBB" w:sz="1"/>
+              <w:left w:val="single" w:color="BBBBBB" w:sz="1"/>
+              <w:bottom w:val="single" w:color="BBBBBB" w:sz="1"/>
+              <w:right w:val="single" w:color="BBBBBB" w:sz="1"/>
+            </w:tcBorders>
+            <w:tcMar>
+              <w:top w:type="dxa" w:w="80"/>
+              <w:left w:type="dxa" w:w="120"/>
+              <w:bottom w:type="dxa" w:w="80"/>
+              <w:right w:type="dxa" w:w="120"/>
+            </w:tcMar>
+          </w:tcPr>
+          <w:p>
+            <w:r>
+              <w:rPr>
+                <w:sz w:val="20"/>
+                <w:szCs w:val="20"/>
+              </w:rPr>
+              <w:t xml:space="preserve">Microservices</w:t>
+            </w:r>
+          </w:p>
+        </w:tc>
+        <w:tc>
+          <w:tcPr>
+            <w:tcW w:type="dxa" w:w="6760"/>
+            <w:tcBorders>
+              <w:top w:val="single" w:color="BBBBBB" w:sz="1"/>
+              <w:left w:val="single" w:color="BBBBBB" w:sz="1"/>
+              <w:bottom w:val="single" w:color="BBBBBB" w:sz="1"/>
+              <w:right w:val="single" w:color="BBBBBB" w:sz="1"/>
+            </w:tcBorders>
+            <w:tcMar>
+              <w:top w:type="dxa" w:w="80"/>
+              <w:left w:type="dxa" w:w="120"/>
+              <w:bottom w:type="dxa" w:w="80"/>
+              <w:right w:type="dxa" w:w="120"/>
+            </w:tcMar>
+          </w:tcPr>
+          <w:p>
+            <w:r>
+              <w:rPr>
+                <w:sz w:val="20"/>
+                <w:szCs w:val="20"/>
+              </w:rPr>
+              <w:t xml:space="preserve">An architecture where the system is several small independent programs (services), each with one job, cooperating over the network — KnowVault has seven.</w:t>
+            </w:r>
+          </w:p>
+        </w:tc>
+      </w:tr>
+      <w:tr>
+        <w:tc>
+          <w:tcPr>
+            <w:tcW w:type="dxa" w:w="2600"/>
+            <w:tcBorders>
+              <w:top w:val="single" w:color="BBBBBB" w:sz="1"/>
+              <w:left w:val="single" w:color="BBBBBB" w:sz="1"/>
+              <w:bottom w:val="single" w:color="BBBBBB" w:sz="1"/>
+              <w:right w:val="single" w:color="BBBBBB" w:sz="1"/>
+            </w:tcBorders>
+            <w:tcMar>
+              <w:top w:type="dxa" w:w="80"/>
+              <w:left w:type="dxa" w:w="120"/>
+              <w:bottom w:type="dxa" w:w="80"/>
+              <w:right w:type="dxa" w:w="120"/>
+            </w:tcMar>
+          </w:tcPr>
+          <w:p>
+            <w:r>
+              <w:rPr>
+                <w:sz w:val="20"/>
+                <w:szCs w:val="20"/>
+              </w:rPr>
+              <w:t xml:space="preserve">Monolith</w:t>
+            </w:r>
+          </w:p>
+        </w:tc>
+        <w:tc>
+          <w:tcPr>
+            <w:tcW w:type="dxa" w:w="6760"/>
+            <w:tcBorders>
+              <w:top w:val="single" w:color="BBBBBB" w:sz="1"/>
+              <w:left w:val="single" w:color="BBBBBB" w:sz="1"/>
+              <w:bottom w:val="single" w:color="BBBBBB" w:sz="1"/>
+              <w:right w:val="single" w:color="BBBBBB" w:sz="1"/>
+            </w:tcBorders>
+            <w:tcMar>
+              <w:top w:type="dxa" w:w="80"/>
+              <w:left w:type="dxa" w:w="120"/>
+              <w:bottom w:type="dxa" w:w="80"/>
+              <w:right w:type="dxa" w:w="120"/>
+            </w:tcMar>
+          </w:tcPr>
+          <w:p>
+            <w:r>
+              <w:rPr>
+                <w:sz w:val="20"/>
+                <w:szCs w:val="20"/>
+              </w:rPr>
+              <w:t xml:space="preserve">The opposite architecture: all functionality inside one single running program. KnowVault is NOT a monolith.</w:t>
+            </w:r>
+          </w:p>
+        </w:tc>
+      </w:tr>
+      <w:tr>
+        <w:tc>
+          <w:tcPr>
+            <w:tcW w:type="dxa" w:w="2600"/>
+            <w:tcBorders>
+              <w:top w:val="single" w:color="BBBBBB" w:sz="1"/>
+              <w:left w:val="single" w:color="BBBBBB" w:sz="1"/>
+              <w:bottom w:val="single" w:color="BBBBBB" w:sz="1"/>
+              <w:right w:val="single" w:color="BBBBBB" w:sz="1"/>
+            </w:tcBorders>
+            <w:tcMar>
+              <w:top w:type="dxa" w:w="80"/>
+              <w:left w:type="dxa" w:w="120"/>
+              <w:bottom w:type="dxa" w:w="80"/>
+              <w:right w:type="dxa" w:w="120"/>
+            </w:tcMar>
+          </w:tcPr>
+          <w:p>
+            <w:r>
+              <w:rPr>
+                <w:sz w:val="20"/>
+                <w:szCs w:val="20"/>
+              </w:rPr>
+              <w:t xml:space="preserve">Monorepo</w:t>
+            </w:r>
+          </w:p>
+        </w:tc>
+        <w:tc>
+          <w:tcPr>
+            <w:tcW w:type="dxa" w:w="6760"/>
+            <w:tcBorders>
+              <w:top w:val="single" w:color="BBBBBB" w:sz="1"/>
+              <w:left w:val="single" w:color="BBBBBB" w:sz="1"/>
+              <w:bottom w:val="single" w:color="BBBBBB" w:sz="1"/>
+              <w:right w:val="single" w:color="BBBBBB" w:sz="1"/>
+            </w:tcBorders>
+            <w:tcMar>
+              <w:top w:type="dxa" w:w="80"/>
+              <w:left w:type="dxa" w:w="120"/>
+              <w:bottom w:type="dxa" w:w="80"/>
+              <w:right w:type="dxa" w:w="120"/>
+            </w:tcMar>
+          </w:tcPr>
+          <w:p>
+            <w:r>
+              <w:rPr>
+                <w:sz w:val="20"/>
+                <w:szCs w:val="20"/>
+              </w:rPr>
+              <w:t xml:space="preserve">All source code kept in one repository. A filing decision, independent of architecture — a monorepo can contain microservices, as KnowVault does.</w:t>
             </w:r>
           </w:p>
         </w:tc>

</xml_diff>

<commit_message>
Docs v1.2: OpenAI live, Phase 1 at 85%, vector search proven
Co-Authored-By: Claude Fable 5 <noreply@anthropic.com>
</commit_message>
<xml_diff>
--- a/docs/KnowVault-Project-Documentation.docx
+++ b/docs/KnowVault-Project-Documentation.docx
@@ -55,7 +55,7 @@
           <w:sz w:val="22"/>
           <w:szCs w:val="22"/>
         </w:rPr>
-        <w:t xml:space="preserve">Document version 1.1  |  8 July 2026  |  Covers work completed through the first Azure deployment</w:t>
+        <w:t xml:space="preserve">Document version 1.2  |  9 July 2026  |  Covers work through real embeddings and searchable indexing</w:t>
       </w:r>
     </w:p>
     <w:p>
@@ -7327,6 +7327,60 @@
           </w:p>
         </w:tc>
       </w:tr>
+      <w:tr>
+        <w:tc>
+          <w:tcPr>
+            <w:tcW w:type="dxa" w:w="2000"/>
+            <w:tcBorders>
+              <w:top w:val="single" w:color="BBBBBB" w:sz="1"/>
+              <w:left w:val="single" w:color="BBBBBB" w:sz="1"/>
+              <w:bottom w:val="single" w:color="BBBBBB" w:sz="1"/>
+              <w:right w:val="single" w:color="BBBBBB" w:sz="1"/>
+            </w:tcBorders>
+            <w:tcMar>
+              <w:top w:type="dxa" w:w="80"/>
+              <w:left w:type="dxa" w:w="120"/>
+              <w:bottom w:type="dxa" w:w="80"/>
+              <w:right w:type="dxa" w:w="120"/>
+            </w:tcMar>
+          </w:tcPr>
+          <w:p>
+            <w:r>
+              <w:rPr>
+                <w:sz w:val="20"/>
+                <w:szCs w:val="20"/>
+              </w:rPr>
+              <w:t xml:space="preserve">b04d000</w:t>
+            </w:r>
+          </w:p>
+        </w:tc>
+        <w:tc>
+          <w:tcPr>
+            <w:tcW w:type="dxa" w:w="7360"/>
+            <w:tcBorders>
+              <w:top w:val="single" w:color="BBBBBB" w:sz="1"/>
+              <w:left w:val="single" w:color="BBBBBB" w:sz="1"/>
+              <w:bottom w:val="single" w:color="BBBBBB" w:sz="1"/>
+              <w:right w:val="single" w:color="BBBBBB" w:sz="1"/>
+            </w:tcBorders>
+            <w:tcMar>
+              <w:top w:type="dxa" w:w="80"/>
+              <w:left w:type="dxa" w:w="120"/>
+              <w:bottom w:type="dxa" w:w="80"/>
+              <w:right w:type="dxa" w:w="120"/>
+            </w:tcMar>
+          </w:tcPr>
+          <w:p>
+            <w:r>
+              <w:rPr>
+                <w:sz w:val="20"/>
+                <w:szCs w:val="20"/>
+              </w:rPr>
+              <w:t xml:space="preserve">Real embeddings and indexing: Azure OpenAI embedder + AI Search/Cosmos sink; documents are now genuinely searchable by keyword and by meaning.</w:t>
+            </w:r>
+          </w:p>
+        </w:tc>
+      </w:tr>
     </w:tbl>
     <w:p>
       <w:r>
@@ -8276,7 +8330,7 @@
                 <w:sz w:val="20"/>
                 <w:szCs w:val="20"/>
               </w:rPr>
-              <w:t xml:space="preserve">Microsoft-hosted OpenAI models. Two deployments: text-embedding-3-large (turns text into meaning vectors during ingestion and questions into vectors at query time) and gpt-5-mini (writes the answers). Pay-per-use only.</w:t>
+              <w:t xml:space="preserve">Microsoft-hosted OpenAI models. Two deployments: text-embedding-3-large (turns text into meaning vectors during ingestion and questions into vectors at query time) and gpt-5-mini (writes the answers). Pay-per-use only. The new-subscription safety block (see 10.3) cleared overnight and the account deployed on 9 July.</w:t>
             </w:r>
           </w:p>
         </w:tc>
@@ -8302,7 +8356,16 @@
                 <w:sz w:val="20"/>
                 <w:szCs w:val="20"/>
               </w:rPr>
-              <w:t xml:space="preserve">Pending — new-subscription safety block, retry ≈1 day (see 10.3)</w:t>
+              <w:t xml:space="preserve">Live</w:t>
+            </w:r>
+          </w:p>
+          <w:p>
+            <w:r>
+              <w:rPr>
+                <w:sz w:val="20"/>
+                <w:szCs w:val="20"/>
+              </w:rPr>
+              <w:t xml:space="preserve">oai-knowvault-dev-…</w:t>
             </w:r>
           </w:p>
         </w:tc>
@@ -9921,7 +9984,7 @@
                 <w:sz w:val="20"/>
                 <w:szCs w:val="20"/>
               </w:rPr>
-              <w:t xml:space="preserve">≈60%</w:t>
+              <w:t xml:space="preserve">≈85%</w:t>
             </w:r>
           </w:p>
         </w:tc>
@@ -9947,7 +10010,7 @@
                 <w:sz w:val="20"/>
                 <w:szCs w:val="20"/>
               </w:rPr>
-              <w:t xml:space="preserve">Upload → queue → parse → chunk flow built and proven locally. Remaining: real embeddings + real index writes (blocked on Azure OpenAI), PDF support, Event Grid message mapping, durable duplicate-ledger in SQL, dead-letter replay tool.</w:t>
+              <w:t xml:space="preserve">Full pipeline proven against real Azure on 9 July: uploaded document → 4 chunks embedded with text-embedding-3-large → indexed in AI Search + Cosmos; both keyword search and pure meaning-based (vector) search return the correct chunks. Remaining: PDF support, Event Grid message mapping, durable duplicate-ledger in SQL, dead-letter replay tool.</w:t>
             </w:r>
           </w:p>
         </w:tc>
@@ -10371,7 +10434,7 @@
         <w:spacing w:after="60"/>
       </w:pPr>
       <w:r>
-        <w:t xml:space="preserve">Re-run the deployment with the OpenAI switch on (after the new-subscription block clears).</w:t>
+        <w:t xml:space="preserve">Begin Phase 2: the Query service — hybrid (keyword + vector) retrieval with the mandatory tenant and permission filters.</w:t>
       </w:r>
     </w:p>
     <w:p>
@@ -10384,7 +10447,7 @@
         <w:spacing w:after="60"/>
       </w:pPr>
       <w:r>
-        <w:t xml:space="preserve">Replace the placeholder embedder with real Azure OpenAI embedding calls.</w:t>
+        <w:t xml:space="preserve">The Answer service: grounded prompt to gpt-5-mini, streamed answers, [n] citations, and honest refusals.</w:t>
       </w:r>
     </w:p>
     <w:p>
@@ -10397,7 +10460,7 @@
         <w:spacing w:after="60"/>
       </w:pPr>
       <w:r>
-        <w:t xml:space="preserve">Replace the placeholder sink with real writes: create the search index (with the allowed-readers field) and store chunks in AI Search + Cosmos DB.</w:t>
+        <w:t xml:space="preserve">A minimal chat page for demos and day-to-day quality checking.</w:t>
       </w:r>
     </w:p>
     <w:p>
@@ -10410,7 +10473,7 @@
         <w:spacing w:after="60"/>
       </w:pPr>
       <w:r>
-        <w:t xml:space="preserve">At that point an uploaded document becomes genuinely searchable — and Phase 2 (asking questions) begins.</w:t>
+        <w:t xml:space="preserve">Round out Phase 1 in parallel: PDF extraction, Event Grid message mapping, durable duplicate-ledger, dead-letter replay tool.</w:t>
       </w:r>
     </w:p>
     <w:p>

</xml_diff>

<commit_message>
Docs v1.3: Phases 0-5 documented, all service statuses current
Co-Authored-By: Claude Fable 5 <noreply@anthropic.com>
</commit_message>
<xml_diff>
--- a/docs/KnowVault-Project-Documentation.docx
+++ b/docs/KnowVault-Project-Documentation.docx
@@ -55,7 +55,7 @@
           <w:sz w:val="22"/>
           <w:szCs w:val="22"/>
         </w:rPr>
-        <w:t xml:space="preserve">Document version 1.2  |  9 July 2026  |  Covers work through real embeddings and searchable indexing</w:t>
+        <w:t xml:space="preserve">Document version 1.3  |  10 July 2026  |  Covers Phases 0-5: ingestion, search, answers, evals, security trimming, connector sync</w:t>
       </w:r>
     </w:p>
     <w:p>
@@ -614,7 +614,7 @@
         <w:t xml:space="preserve">Current status: </w:t>
       </w:r>
       <w:r>
-        <w:t xml:space="preserve">flow one is built and working (with a placeholder for the embedding step until the AI service finishes provisioning). Flow two is the next phase of the project.</w:t>
+        <w:t xml:space="preserve">both flows are built and verified end-to-end against real Azure services: documents (markdown, text, and PDF) become searchable within seconds, and questions receive streamed, cited answers that respect per-user permissions.</w:t>
       </w:r>
     </w:p>
     <w:p>
@@ -1817,7 +1817,7 @@
                 <w:sz w:val="20"/>
                 <w:szCs w:val="20"/>
               </w:rPr>
-              <w:t xml:space="preserve">Will pull documents and their permission lists from SharePoint automatically (Phase 5). Currently a placeholder shell.</w:t>
+              <w:t xml:space="preserve">The sync engine: watches document sources on an interval, detects additions/edits/deletions by content fingerprint, captures per-document permissions, and emits change messages. A local-folder connector is live; SharePoint plugs into the same interface.</w:t>
             </w:r>
           </w:p>
         </w:tc>
@@ -1871,7 +1871,7 @@
                 <w:sz w:val="20"/>
                 <w:szCs w:val="20"/>
               </w:rPr>
-              <w:t xml:space="preserve">The document processor: listens to the queue, downloads files, splits them into chunks, gets embeddings, writes to the search index. Built and working.</w:t>
+              <w:t xml:space="preserve">The document processor: listens to the queue, downloads files (PDF via Document Intelligence), splits them into chunks, gets embeddings, writes to the search index — and removes chunks when a deletion tombstone arrives. Built and working.</w:t>
             </w:r>
           </w:p>
         </w:tc>
@@ -1925,7 +1925,7 @@
                 <w:sz w:val="20"/>
                 <w:szCs w:val="20"/>
               </w:rPr>
-              <w:t xml:space="preserve">Will perform the permission-filtered hybrid search (Phase 2). Currently a placeholder shell.</w:t>
+              <w:t xml:space="preserve">The permission-filtered hybrid search: embeds the question, combines keyword + meaning search, and applies the mandatory security-trimming filter built from the caller's identity. Built and working.</w:t>
             </w:r>
           </w:p>
         </w:tc>
@@ -1979,7 +1979,7 @@
                 <w:sz w:val="20"/>
                 <w:szCs w:val="20"/>
               </w:rPr>
-              <w:t xml:space="preserve">Will assemble the AI prompt, stream the answer, and attach citations (Phase 2). Currently a placeholder shell.</w:t>
+              <w:t xml:space="preserve">Assembles the grounded prompt, streams the answer token-by-token with [n] citations, refuses when sources are insufficient, and serves the chat page. Built and working.</w:t>
             </w:r>
           </w:p>
         </w:tc>
@@ -2033,7 +2033,7 @@
                 <w:sz w:val="20"/>
                 <w:szCs w:val="20"/>
               </w:rPr>
-              <w:t xml:space="preserve">Will run the golden-question quality tests (Phase 4). Currently a placeholder shell.</w:t>
+              <w:t xml:space="preserve">Runs the golden-question quality suite against the live pipeline: retrieval accuracy, groundedness, citation accuracy, refusals, and the always-100% security checks. Built and working.</w:t>
             </w:r>
           </w:p>
         </w:tc>
@@ -5470,7 +5470,851 @@
         <w:pStyle w:val="Heading2"/>
       </w:pPr>
       <w:r>
-        <w:t xml:space="preserve">6.7 Automation, evals, docs, scripts</w:t>
+        <w:t xml:space="preserve">6.7 Files added in Phases 2-5</w:t>
+      </w:r>
+    </w:p>
+    <w:tbl>
+      <w:tblPr>
+        <w:tblW w:type="dxa" w:w="9360"/>
+        <w:tblBorders>
+          <w:top w:val="single" w:color="auto" w:sz="4"/>
+          <w:left w:val="single" w:color="auto" w:sz="4"/>
+          <w:bottom w:val="single" w:color="auto" w:sz="4"/>
+          <w:right w:val="single" w:color="auto" w:sz="4"/>
+          <w:insideH w:val="single" w:color="auto" w:sz="4"/>
+          <w:insideV w:val="single" w:color="auto" w:sz="4"/>
+        </w:tblBorders>
+      </w:tblPr>
+      <w:tblGrid>
+        <w:gridCol w:w="3600"/>
+        <w:gridCol w:w="5760"/>
+      </w:tblGrid>
+      <w:tr>
+        <w:trPr>
+          <w:tblHeader/>
+        </w:trPr>
+        <w:tc>
+          <w:tcPr>
+            <w:tcW w:type="dxa" w:w="3600"/>
+            <w:tcBorders>
+              <w:top w:val="single" w:color="BBBBBB" w:sz="1"/>
+              <w:left w:val="single" w:color="BBBBBB" w:sz="1"/>
+              <w:bottom w:val="single" w:color="BBBBBB" w:sz="1"/>
+              <w:right w:val="single" w:color="BBBBBB" w:sz="1"/>
+            </w:tcBorders>
+            <w:shd w:fill="D5E8F0" w:val="clear"/>
+            <w:tcMar>
+              <w:top w:type="dxa" w:w="80"/>
+              <w:left w:type="dxa" w:w="120"/>
+              <w:bottom w:type="dxa" w:w="80"/>
+              <w:right w:type="dxa" w:w="120"/>
+            </w:tcMar>
+          </w:tcPr>
+          <w:p>
+            <w:r>
+              <w:rPr>
+                <w:b/>
+                <w:bCs/>
+                <w:sz w:val="20"/>
+                <w:szCs w:val="20"/>
+              </w:rPr>
+              <w:t xml:space="preserve">File</w:t>
+            </w:r>
+          </w:p>
+        </w:tc>
+        <w:tc>
+          <w:tcPr>
+            <w:tcW w:type="dxa" w:w="5760"/>
+            <w:tcBorders>
+              <w:top w:val="single" w:color="BBBBBB" w:sz="1"/>
+              <w:left w:val="single" w:color="BBBBBB" w:sz="1"/>
+              <w:bottom w:val="single" w:color="BBBBBB" w:sz="1"/>
+              <w:right w:val="single" w:color="BBBBBB" w:sz="1"/>
+            </w:tcBorders>
+            <w:shd w:fill="D5E8F0" w:val="clear"/>
+            <w:tcMar>
+              <w:top w:type="dxa" w:w="80"/>
+              <w:left w:type="dxa" w:w="120"/>
+              <w:bottom w:type="dxa" w:w="80"/>
+              <w:right w:type="dxa" w:w="120"/>
+            </w:tcMar>
+          </w:tcPr>
+          <w:p>
+            <w:r>
+              <w:rPr>
+                <w:b/>
+                <w:bCs/>
+                <w:sz w:val="20"/>
+                <w:szCs w:val="20"/>
+              </w:rPr>
+              <w:t xml:space="preserve">What it does</w:t>
+            </w:r>
+          </w:p>
+        </w:tc>
+      </w:tr>
+      <w:tr>
+        <w:tc>
+          <w:tcPr>
+            <w:tcW w:type="dxa" w:w="3600"/>
+            <w:tcBorders>
+              <w:top w:val="single" w:color="BBBBBB" w:sz="1"/>
+              <w:left w:val="single" w:color="BBBBBB" w:sz="1"/>
+              <w:bottom w:val="single" w:color="BBBBBB" w:sz="1"/>
+              <w:right w:val="single" w:color="BBBBBB" w:sz="1"/>
+            </w:tcBorders>
+            <w:tcMar>
+              <w:top w:type="dxa" w:w="80"/>
+              <w:left w:type="dxa" w:w="120"/>
+              <w:bottom w:type="dxa" w:w="80"/>
+              <w:right w:type="dxa" w:w="120"/>
+            </w:tcMar>
+          </w:tcPr>
+          <w:p>
+            <w:r>
+              <w:rPr>
+                <w:sz w:val="20"/>
+                <w:szCs w:val="20"/>
+              </w:rPr>
+              <w:t xml:space="preserve">Domain/Security/SecurityTrimming.cs + PrincipalContext.cs</w:t>
+            </w:r>
+          </w:p>
+        </w:tc>
+        <w:tc>
+          <w:tcPr>
+            <w:tcW w:type="dxa" w:w="5760"/>
+            <w:tcBorders>
+              <w:top w:val="single" w:color="BBBBBB" w:sz="1"/>
+              <w:left w:val="single" w:color="BBBBBB" w:sz="1"/>
+              <w:bottom w:val="single" w:color="BBBBBB" w:sz="1"/>
+              <w:right w:val="single" w:color="BBBBBB" w:sz="1"/>
+            </w:tcBorders>
+            <w:tcMar>
+              <w:top w:type="dxa" w:w="80"/>
+              <w:left w:type="dxa" w:w="120"/>
+              <w:bottom w:type="dxa" w:w="80"/>
+              <w:right w:type="dxa" w:w="120"/>
+            </w:tcMar>
+          </w:tcPr>
+          <w:p>
+            <w:r>
+              <w:rPr>
+                <w:sz w:val="20"/>
+                <w:szCs w:val="20"/>
+              </w:rPr>
+              <w:t xml:space="preserve">The heart of the security model: the ONE place the mandatory search filter is built from the caller's verified identity (tenant + user + groups). Rejects hostile input (injection attempts); covered by dedicated attack tests.</w:t>
+            </w:r>
+          </w:p>
+        </w:tc>
+      </w:tr>
+      <w:tr>
+        <w:tc>
+          <w:tcPr>
+            <w:tcW w:type="dxa" w:w="3600"/>
+            <w:tcBorders>
+              <w:top w:val="single" w:color="BBBBBB" w:sz="1"/>
+              <w:left w:val="single" w:color="BBBBBB" w:sz="1"/>
+              <w:bottom w:val="single" w:color="BBBBBB" w:sz="1"/>
+              <w:right w:val="single" w:color="BBBBBB" w:sz="1"/>
+            </w:tcBorders>
+            <w:tcMar>
+              <w:top w:type="dxa" w:w="80"/>
+              <w:left w:type="dxa" w:w="120"/>
+              <w:bottom w:type="dxa" w:w="80"/>
+              <w:right w:type="dxa" w:w="120"/>
+            </w:tcMar>
+          </w:tcPr>
+          <w:p>
+            <w:r>
+              <w:rPr>
+                <w:sz w:val="20"/>
+                <w:szCs w:val="20"/>
+              </w:rPr>
+              <w:t xml:space="preserve">Query/Retrieval/HybridRetriever.cs</w:t>
+            </w:r>
+          </w:p>
+        </w:tc>
+        <w:tc>
+          <w:tcPr>
+            <w:tcW w:type="dxa" w:w="5760"/>
+            <w:tcBorders>
+              <w:top w:val="single" w:color="BBBBBB" w:sz="1"/>
+              <w:left w:val="single" w:color="BBBBBB" w:sz="1"/>
+              <w:bottom w:val="single" w:color="BBBBBB" w:sz="1"/>
+              <w:right w:val="single" w:color="BBBBBB" w:sz="1"/>
+            </w:tcBorders>
+            <w:tcMar>
+              <w:top w:type="dxa" w:w="80"/>
+              <w:left w:type="dxa" w:w="120"/>
+              <w:bottom w:type="dxa" w:w="80"/>
+              <w:right w:type="dxa" w:w="120"/>
+            </w:tcMar>
+          </w:tcPr>
+          <w:p>
+            <w:r>
+              <w:rPr>
+                <w:sz w:val="20"/>
+                <w:szCs w:val="20"/>
+              </w:rPr>
+              <w:t xml:space="preserve">Embeds the question and runs keyword + vector search in one request with the security filter always attached.</w:t>
+            </w:r>
+          </w:p>
+        </w:tc>
+      </w:tr>
+      <w:tr>
+        <w:tc>
+          <w:tcPr>
+            <w:tcW w:type="dxa" w:w="3600"/>
+            <w:tcBorders>
+              <w:top w:val="single" w:color="BBBBBB" w:sz="1"/>
+              <w:left w:val="single" w:color="BBBBBB" w:sz="1"/>
+              <w:bottom w:val="single" w:color="BBBBBB" w:sz="1"/>
+              <w:right w:val="single" w:color="BBBBBB" w:sz="1"/>
+            </w:tcBorders>
+            <w:tcMar>
+              <w:top w:type="dxa" w:w="80"/>
+              <w:left w:type="dxa" w:w="120"/>
+              <w:bottom w:type="dxa" w:w="80"/>
+              <w:right w:type="dxa" w:w="120"/>
+            </w:tcMar>
+          </w:tcPr>
+          <w:p>
+            <w:r>
+              <w:rPr>
+                <w:sz w:val="20"/>
+                <w:szCs w:val="20"/>
+              </w:rPr>
+              <w:t xml:space="preserve">Query/Retrieval/DevUserDirectory.cs</w:t>
+            </w:r>
+          </w:p>
+        </w:tc>
+        <w:tc>
+          <w:tcPr>
+            <w:tcW w:type="dxa" w:w="5760"/>
+            <w:tcBorders>
+              <w:top w:val="single" w:color="BBBBBB" w:sz="1"/>
+              <w:left w:val="single" w:color="BBBBBB" w:sz="1"/>
+              <w:bottom w:val="single" w:color="BBBBBB" w:sz="1"/>
+              <w:right w:val="single" w:color="BBBBBB" w:sz="1"/>
+            </w:tcBorders>
+            <w:tcMar>
+              <w:top w:type="dxa" w:w="80"/>
+              <w:left w:type="dxa" w:w="120"/>
+              <w:bottom w:type="dxa" w:w="80"/>
+              <w:right w:type="dxa" w:w="120"/>
+            </w:tcMar>
+          </w:tcPr>
+          <w:p>
+            <w:r>
+              <w:rPr>
+                <w:sz w:val="20"/>
+                <w:szCs w:val="20"/>
+              </w:rPr>
+              <w:t xml:space="preserve">Local stand-in for Entra ID group membership: user-to-groups mapping from configuration, resolved server-side so callers can never grant themselves groups.</w:t>
+            </w:r>
+          </w:p>
+        </w:tc>
+      </w:tr>
+      <w:tr>
+        <w:tc>
+          <w:tcPr>
+            <w:tcW w:type="dxa" w:w="3600"/>
+            <w:tcBorders>
+              <w:top w:val="single" w:color="BBBBBB" w:sz="1"/>
+              <w:left w:val="single" w:color="BBBBBB" w:sz="1"/>
+              <w:bottom w:val="single" w:color="BBBBBB" w:sz="1"/>
+              <w:right w:val="single" w:color="BBBBBB" w:sz="1"/>
+            </w:tcBorders>
+            <w:tcMar>
+              <w:top w:type="dxa" w:w="80"/>
+              <w:left w:type="dxa" w:w="120"/>
+              <w:bottom w:type="dxa" w:w="80"/>
+              <w:right w:type="dxa" w:w="120"/>
+            </w:tcMar>
+          </w:tcPr>
+          <w:p>
+            <w:r>
+              <w:rPr>
+                <w:sz w:val="20"/>
+                <w:szCs w:val="20"/>
+              </w:rPr>
+              <w:t xml:space="preserve">Answer/Answering/GroundedAnswerer.cs</w:t>
+            </w:r>
+          </w:p>
+        </w:tc>
+        <w:tc>
+          <w:tcPr>
+            <w:tcW w:type="dxa" w:w="5760"/>
+            <w:tcBorders>
+              <w:top w:val="single" w:color="BBBBBB" w:sz="1"/>
+              <w:left w:val="single" w:color="BBBBBB" w:sz="1"/>
+              <w:bottom w:val="single" w:color="BBBBBB" w:sz="1"/>
+              <w:right w:val="single" w:color="BBBBBB" w:sz="1"/>
+            </w:tcBorders>
+            <w:tcMar>
+              <w:top w:type="dxa" w:w="80"/>
+              <w:left w:type="dxa" w:w="120"/>
+              <w:bottom w:type="dxa" w:w="80"/>
+              <w:right w:type="dxa" w:w="120"/>
+            </w:tcMar>
+          </w:tcPr>
+          <w:p>
+            <w:r>
+              <w:rPr>
+                <w:sz w:val="20"/>
+                <w:szCs w:val="20"/>
+              </w:rPr>
+              <w:t xml:space="preserve">Retrieves sources as the calling user, builds the strict answer-only-from-sources prompt, streams gpt-5-mini output.</w:t>
+            </w:r>
+          </w:p>
+        </w:tc>
+      </w:tr>
+      <w:tr>
+        <w:tc>
+          <w:tcPr>
+            <w:tcW w:type="dxa" w:w="3600"/>
+            <w:tcBorders>
+              <w:top w:val="single" w:color="BBBBBB" w:sz="1"/>
+              <w:left w:val="single" w:color="BBBBBB" w:sz="1"/>
+              <w:bottom w:val="single" w:color="BBBBBB" w:sz="1"/>
+              <w:right w:val="single" w:color="BBBBBB" w:sz="1"/>
+            </w:tcBorders>
+            <w:tcMar>
+              <w:top w:type="dxa" w:w="80"/>
+              <w:left w:type="dxa" w:w="120"/>
+              <w:bottom w:type="dxa" w:w="80"/>
+              <w:right w:type="dxa" w:w="120"/>
+            </w:tcMar>
+          </w:tcPr>
+          <w:p>
+            <w:r>
+              <w:rPr>
+                <w:sz w:val="20"/>
+                <w:szCs w:val="20"/>
+              </w:rPr>
+              <w:t xml:space="preserve">Answer/wwwroot/index.html</w:t>
+            </w:r>
+          </w:p>
+        </w:tc>
+        <w:tc>
+          <w:tcPr>
+            <w:tcW w:type="dxa" w:w="5760"/>
+            <w:tcBorders>
+              <w:top w:val="single" w:color="BBBBBB" w:sz="1"/>
+              <w:left w:val="single" w:color="BBBBBB" w:sz="1"/>
+              <w:bottom w:val="single" w:color="BBBBBB" w:sz="1"/>
+              <w:right w:val="single" w:color="BBBBBB" w:sz="1"/>
+            </w:tcBorders>
+            <w:tcMar>
+              <w:top w:type="dxa" w:w="80"/>
+              <w:left w:type="dxa" w:w="120"/>
+              <w:bottom w:type="dxa" w:w="80"/>
+              <w:right w:type="dxa" w:w="120"/>
+            </w:tcMar>
+          </w:tcPr>
+          <w:p>
+            <w:r>
+              <w:rPr>
+                <w:sz w:val="20"/>
+                <w:szCs w:val="20"/>
+              </w:rPr>
+              <w:t xml:space="preserve">The chat page: streaming answers, citation highlighting, tenant/user switcher for permission demos.</w:t>
+            </w:r>
+          </w:p>
+        </w:tc>
+      </w:tr>
+      <w:tr>
+        <w:tc>
+          <w:tcPr>
+            <w:tcW w:type="dxa" w:w="3600"/>
+            <w:tcBorders>
+              <w:top w:val="single" w:color="BBBBBB" w:sz="1"/>
+              <w:left w:val="single" w:color="BBBBBB" w:sz="1"/>
+              <w:bottom w:val="single" w:color="BBBBBB" w:sz="1"/>
+              <w:right w:val="single" w:color="BBBBBB" w:sz="1"/>
+            </w:tcBorders>
+            <w:tcMar>
+              <w:top w:type="dxa" w:w="80"/>
+              <w:left w:type="dxa" w:w="120"/>
+              <w:bottom w:type="dxa" w:w="80"/>
+              <w:right w:type="dxa" w:w="120"/>
+            </w:tcMar>
+          </w:tcPr>
+          <w:p>
+            <w:r>
+              <w:rPr>
+                <w:sz w:val="20"/>
+                <w:szCs w:val="20"/>
+              </w:rPr>
+              <w:t xml:space="preserve">Eval/Evaluation/* (5 files)</w:t>
+            </w:r>
+          </w:p>
+        </w:tc>
+        <w:tc>
+          <w:tcPr>
+            <w:tcW w:type="dxa" w:w="5760"/>
+            <w:tcBorders>
+              <w:top w:val="single" w:color="BBBBBB" w:sz="1"/>
+              <w:left w:val="single" w:color="BBBBBB" w:sz="1"/>
+              <w:bottom w:val="single" w:color="BBBBBB" w:sz="1"/>
+              <w:right w:val="single" w:color="BBBBBB" w:sz="1"/>
+            </w:tcBorders>
+            <w:tcMar>
+              <w:top w:type="dxa" w:w="80"/>
+              <w:left w:type="dxa" w:w="120"/>
+              <w:bottom w:type="dxa" w:w="80"/>
+              <w:right w:type="dxa" w:w="120"/>
+            </w:tcMar>
+          </w:tcPr>
+          <w:p>
+            <w:r>
+              <w:rPr>
+                <w:sz w:val="20"/>
+                <w:szCs w:val="20"/>
+              </w:rPr>
+              <w:t xml:space="preserve">The eval harness: corpus seeding through the real pipeline, metric computation, LLM judge, security checks, report writer.</w:t>
+            </w:r>
+          </w:p>
+        </w:tc>
+      </w:tr>
+      <w:tr>
+        <w:tc>
+          <w:tcPr>
+            <w:tcW w:type="dxa" w:w="3600"/>
+            <w:tcBorders>
+              <w:top w:val="single" w:color="BBBBBB" w:sz="1"/>
+              <w:left w:val="single" w:color="BBBBBB" w:sz="1"/>
+              <w:bottom w:val="single" w:color="BBBBBB" w:sz="1"/>
+              <w:right w:val="single" w:color="BBBBBB" w:sz="1"/>
+            </w:tcBorders>
+            <w:tcMar>
+              <w:top w:type="dxa" w:w="80"/>
+              <w:left w:type="dxa" w:w="120"/>
+              <w:bottom w:type="dxa" w:w="80"/>
+              <w:right w:type="dxa" w:w="120"/>
+            </w:tcMar>
+          </w:tcPr>
+          <w:p>
+            <w:r>
+              <w:rPr>
+                <w:sz w:val="20"/>
+                <w:szCs w:val="20"/>
+              </w:rPr>
+              <w:t xml:space="preserve">Ingestion/Pipeline/AzureOpenAIChunkEmbedder.cs</w:t>
+            </w:r>
+          </w:p>
+        </w:tc>
+        <w:tc>
+          <w:tcPr>
+            <w:tcW w:type="dxa" w:w="5760"/>
+            <w:tcBorders>
+              <w:top w:val="single" w:color="BBBBBB" w:sz="1"/>
+              <w:left w:val="single" w:color="BBBBBB" w:sz="1"/>
+              <w:bottom w:val="single" w:color="BBBBBB" w:sz="1"/>
+              <w:right w:val="single" w:color="BBBBBB" w:sz="1"/>
+            </w:tcBorders>
+            <w:tcMar>
+              <w:top w:type="dxa" w:w="80"/>
+              <w:left w:type="dxa" w:w="120"/>
+              <w:bottom w:type="dxa" w:w="80"/>
+              <w:right w:type="dxa" w:w="120"/>
+            </w:tcMar>
+          </w:tcPr>
+          <w:p>
+            <w:r>
+              <w:rPr>
+                <w:sz w:val="20"/>
+                <w:szCs w:val="20"/>
+              </w:rPr>
+              <w:t xml:space="preserve">Real embeddings via text-embedding-3-large (3072 dimensions), batched.</w:t>
+            </w:r>
+          </w:p>
+        </w:tc>
+      </w:tr>
+      <w:tr>
+        <w:tc>
+          <w:tcPr>
+            <w:tcW w:type="dxa" w:w="3600"/>
+            <w:tcBorders>
+              <w:top w:val="single" w:color="BBBBBB" w:sz="1"/>
+              <w:left w:val="single" w:color="BBBBBB" w:sz="1"/>
+              <w:bottom w:val="single" w:color="BBBBBB" w:sz="1"/>
+              <w:right w:val="single" w:color="BBBBBB" w:sz="1"/>
+            </w:tcBorders>
+            <w:tcMar>
+              <w:top w:type="dxa" w:w="80"/>
+              <w:left w:type="dxa" w:w="120"/>
+              <w:bottom w:type="dxa" w:w="80"/>
+              <w:right w:type="dxa" w:w="120"/>
+            </w:tcMar>
+          </w:tcPr>
+          <w:p>
+            <w:r>
+              <w:rPr>
+                <w:sz w:val="20"/>
+                <w:szCs w:val="20"/>
+              </w:rPr>
+              <w:t xml:space="preserve">Ingestion/Pipeline/AzureChunkSink.cs</w:t>
+            </w:r>
+          </w:p>
+        </w:tc>
+        <w:tc>
+          <w:tcPr>
+            <w:tcW w:type="dxa" w:w="5760"/>
+            <w:tcBorders>
+              <w:top w:val="single" w:color="BBBBBB" w:sz="1"/>
+              <w:left w:val="single" w:color="BBBBBB" w:sz="1"/>
+              <w:bottom w:val="single" w:color="BBBBBB" w:sz="1"/>
+              <w:right w:val="single" w:color="BBBBBB" w:sz="1"/>
+            </w:tcBorders>
+            <w:tcMar>
+              <w:top w:type="dxa" w:w="80"/>
+              <w:left w:type="dxa" w:w="120"/>
+              <w:bottom w:type="dxa" w:w="80"/>
+              <w:right w:type="dxa" w:w="120"/>
+            </w:tcMar>
+          </w:tcPr>
+          <w:p>
+            <w:r>
+              <w:rPr>
+                <w:sz w:val="20"/>
+                <w:szCs w:val="20"/>
+              </w:rPr>
+              <w:t xml:space="preserve">Writes chunks to AI Search + Cosmos, creates the index on first use, deletes stale chunks on re-ingest and all chunks on tombstones.</w:t>
+            </w:r>
+          </w:p>
+        </w:tc>
+      </w:tr>
+      <w:tr>
+        <w:tc>
+          <w:tcPr>
+            <w:tcW w:type="dxa" w:w="3600"/>
+            <w:tcBorders>
+              <w:top w:val="single" w:color="BBBBBB" w:sz="1"/>
+              <w:left w:val="single" w:color="BBBBBB" w:sz="1"/>
+              <w:bottom w:val="single" w:color="BBBBBB" w:sz="1"/>
+              <w:right w:val="single" w:color="BBBBBB" w:sz="1"/>
+            </w:tcBorders>
+            <w:tcMar>
+              <w:top w:type="dxa" w:w="80"/>
+              <w:left w:type="dxa" w:w="120"/>
+              <w:bottom w:type="dxa" w:w="80"/>
+              <w:right w:type="dxa" w:w="120"/>
+            </w:tcMar>
+          </w:tcPr>
+          <w:p>
+            <w:r>
+              <w:rPr>
+                <w:sz w:val="20"/>
+                <w:szCs w:val="20"/>
+              </w:rPr>
+              <w:t xml:space="preserve">Ingestion/Pipeline/PdfExtractor.cs</w:t>
+            </w:r>
+          </w:p>
+        </w:tc>
+        <w:tc>
+          <w:tcPr>
+            <w:tcW w:type="dxa" w:w="5760"/>
+            <w:tcBorders>
+              <w:top w:val="single" w:color="BBBBBB" w:sz="1"/>
+              <w:left w:val="single" w:color="BBBBBB" w:sz="1"/>
+              <w:bottom w:val="single" w:color="BBBBBB" w:sz="1"/>
+              <w:right w:val="single" w:color="BBBBBB" w:sz="1"/>
+            </w:tcBorders>
+            <w:tcMar>
+              <w:top w:type="dxa" w:w="80"/>
+              <w:left w:type="dxa" w:w="120"/>
+              <w:bottom w:type="dxa" w:w="80"/>
+              <w:right w:type="dxa" w:w="120"/>
+            </w:tcMar>
+          </w:tcPr>
+          <w:p>
+            <w:r>
+              <w:rPr>
+                <w:sz w:val="20"/>
+                <w:szCs w:val="20"/>
+              </w:rPr>
+              <w:t xml:space="preserve">PDF to markdown via Document Intelligence layout analysis, feeding the normal parser path.</w:t>
+            </w:r>
+          </w:p>
+        </w:tc>
+      </w:tr>
+      <w:tr>
+        <w:tc>
+          <w:tcPr>
+            <w:tcW w:type="dxa" w:w="3600"/>
+            <w:tcBorders>
+              <w:top w:val="single" w:color="BBBBBB" w:sz="1"/>
+              <w:left w:val="single" w:color="BBBBBB" w:sz="1"/>
+              <w:bottom w:val="single" w:color="BBBBBB" w:sz="1"/>
+              <w:right w:val="single" w:color="BBBBBB" w:sz="1"/>
+            </w:tcBorders>
+            <w:tcMar>
+              <w:top w:type="dxa" w:w="80"/>
+              <w:left w:type="dxa" w:w="120"/>
+              <w:bottom w:type="dxa" w:w="80"/>
+              <w:right w:type="dxa" w:w="120"/>
+            </w:tcMar>
+          </w:tcPr>
+          <w:p>
+            <w:r>
+              <w:rPr>
+                <w:sz w:val="20"/>
+                <w:szCs w:val="20"/>
+              </w:rPr>
+              <w:t xml:space="preserve">Contracts/Messages/EventGridBlobCreated.cs</w:t>
+            </w:r>
+          </w:p>
+        </w:tc>
+        <w:tc>
+          <w:tcPr>
+            <w:tcW w:type="dxa" w:w="5760"/>
+            <w:tcBorders>
+              <w:top w:val="single" w:color="BBBBBB" w:sz="1"/>
+              <w:left w:val="single" w:color="BBBBBB" w:sz="1"/>
+              <w:bottom w:val="single" w:color="BBBBBB" w:sz="1"/>
+              <w:right w:val="single" w:color="BBBBBB" w:sz="1"/>
+            </w:tcBorders>
+            <w:tcMar>
+              <w:top w:type="dxa" w:w="80"/>
+              <w:left w:type="dxa" w:w="120"/>
+              <w:bottom w:type="dxa" w:w="80"/>
+              <w:right w:type="dxa" w:w="120"/>
+            </w:tcMar>
+          </w:tcPr>
+          <w:p>
+            <w:r>
+              <w:rPr>
+                <w:sz w:val="20"/>
+                <w:szCs w:val="20"/>
+              </w:rPr>
+              <w:t xml:space="preserve">Maps Event Grid's blob-created message format onto our contract, so the Azure upload path needs no translator (unit-tested).</w:t>
+            </w:r>
+          </w:p>
+        </w:tc>
+      </w:tr>
+      <w:tr>
+        <w:tc>
+          <w:tcPr>
+            <w:tcW w:type="dxa" w:w="3600"/>
+            <w:tcBorders>
+              <w:top w:val="single" w:color="BBBBBB" w:sz="1"/>
+              <w:left w:val="single" w:color="BBBBBB" w:sz="1"/>
+              <w:bottom w:val="single" w:color="BBBBBB" w:sz="1"/>
+              <w:right w:val="single" w:color="BBBBBB" w:sz="1"/>
+            </w:tcBorders>
+            <w:tcMar>
+              <w:top w:type="dxa" w:w="80"/>
+              <w:left w:type="dxa" w:w="120"/>
+              <w:bottom w:type="dxa" w:w="80"/>
+              <w:right w:type="dxa" w:w="120"/>
+            </w:tcMar>
+          </w:tcPr>
+          <w:p>
+            <w:r>
+              <w:rPr>
+                <w:sz w:val="20"/>
+                <w:szCs w:val="20"/>
+              </w:rPr>
+              <w:t xml:space="preserve">Connector/Sync/* (3 files)</w:t>
+            </w:r>
+          </w:p>
+        </w:tc>
+        <w:tc>
+          <w:tcPr>
+            <w:tcW w:type="dxa" w:w="5760"/>
+            <w:tcBorders>
+              <w:top w:val="single" w:color="BBBBBB" w:sz="1"/>
+              <w:left w:val="single" w:color="BBBBBB" w:sz="1"/>
+              <w:bottom w:val="single" w:color="BBBBBB" w:sz="1"/>
+              <w:right w:val="single" w:color="BBBBBB" w:sz="1"/>
+            </w:tcBorders>
+            <w:tcMar>
+              <w:top w:type="dxa" w:w="80"/>
+              <w:left w:type="dxa" w:w="120"/>
+              <w:bottom w:type="dxa" w:w="80"/>
+              <w:right w:type="dxa" w:w="120"/>
+            </w:tcMar>
+          </w:tcPr>
+          <w:p>
+            <w:r>
+              <w:rPr>
+                <w:sz w:val="20"/>
+                <w:szCs w:val="20"/>
+              </w:rPr>
+              <w:t xml:space="preserve">The sync engine and connector interface plus the local-folder reference connector (sidecar .acl files carry per-document permissions).</w:t>
+            </w:r>
+          </w:p>
+        </w:tc>
+      </w:tr>
+      <w:tr>
+        <w:tc>
+          <w:tcPr>
+            <w:tcW w:type="dxa" w:w="3600"/>
+            <w:tcBorders>
+              <w:top w:val="single" w:color="BBBBBB" w:sz="1"/>
+              <w:left w:val="single" w:color="BBBBBB" w:sz="1"/>
+              <w:bottom w:val="single" w:color="BBBBBB" w:sz="1"/>
+              <w:right w:val="single" w:color="BBBBBB" w:sz="1"/>
+            </w:tcBorders>
+            <w:tcMar>
+              <w:top w:type="dxa" w:w="80"/>
+              <w:left w:type="dxa" w:w="120"/>
+              <w:bottom w:type="dxa" w:w="80"/>
+              <w:right w:type="dxa" w:w="120"/>
+            </w:tcMar>
+          </w:tcPr>
+          <w:p>
+            <w:r>
+              <w:rPr>
+                <w:sz w:val="20"/>
+                <w:szCs w:val="20"/>
+              </w:rPr>
+              <w:t xml:space="preserve">tools/KnowVault.DlqTool/</w:t>
+            </w:r>
+          </w:p>
+        </w:tc>
+        <w:tc>
+          <w:tcPr>
+            <w:tcW w:type="dxa" w:w="5760"/>
+            <w:tcBorders>
+              <w:top w:val="single" w:color="BBBBBB" w:sz="1"/>
+              <w:left w:val="single" w:color="BBBBBB" w:sz="1"/>
+              <w:bottom w:val="single" w:color="BBBBBB" w:sz="1"/>
+              <w:right w:val="single" w:color="BBBBBB" w:sz="1"/>
+            </w:tcBorders>
+            <w:tcMar>
+              <w:top w:type="dxa" w:w="80"/>
+              <w:left w:type="dxa" w:w="120"/>
+              <w:bottom w:type="dxa" w:w="80"/>
+              <w:right w:type="dxa" w:w="120"/>
+            </w:tcMar>
+          </w:tcPr>
+          <w:p>
+            <w:r>
+              <w:rPr>
+                <w:sz w:val="20"/>
+                <w:szCs w:val="20"/>
+              </w:rPr>
+              <w:t xml:space="preserve">Console tool to inspect and replay dead-lettered messages.</w:t>
+            </w:r>
+          </w:p>
+        </w:tc>
+      </w:tr>
+      <w:tr>
+        <w:tc>
+          <w:tcPr>
+            <w:tcW w:type="dxa" w:w="3600"/>
+            <w:tcBorders>
+              <w:top w:val="single" w:color="BBBBBB" w:sz="1"/>
+              <w:left w:val="single" w:color="BBBBBB" w:sz="1"/>
+              <w:bottom w:val="single" w:color="BBBBBB" w:sz="1"/>
+              <w:right w:val="single" w:color="BBBBBB" w:sz="1"/>
+            </w:tcBorders>
+            <w:tcMar>
+              <w:top w:type="dxa" w:w="80"/>
+              <w:left w:type="dxa" w:w="120"/>
+              <w:bottom w:type="dxa" w:w="80"/>
+              <w:right w:type="dxa" w:w="120"/>
+            </w:tcMar>
+          </w:tcPr>
+          <w:p>
+            <w:r>
+              <w:rPr>
+                <w:sz w:val="20"/>
+                <w:szCs w:val="20"/>
+              </w:rPr>
+              <w:t xml:space="preserve">infra/modules/docintelligence.bicep</w:t>
+            </w:r>
+          </w:p>
+        </w:tc>
+        <w:tc>
+          <w:tcPr>
+            <w:tcW w:type="dxa" w:w="5760"/>
+            <w:tcBorders>
+              <w:top w:val="single" w:color="BBBBBB" w:sz="1"/>
+              <w:left w:val="single" w:color="BBBBBB" w:sz="1"/>
+              <w:bottom w:val="single" w:color="BBBBBB" w:sz="1"/>
+              <w:right w:val="single" w:color="BBBBBB" w:sz="1"/>
+            </w:tcBorders>
+            <w:tcMar>
+              <w:top w:type="dxa" w:w="80"/>
+              <w:left w:type="dxa" w:w="120"/>
+              <w:bottom w:type="dxa" w:w="80"/>
+              <w:right w:type="dxa" w:w="120"/>
+            </w:tcMar>
+          </w:tcPr>
+          <w:p>
+            <w:r>
+              <w:rPr>
+                <w:sz w:val="20"/>
+                <w:szCs w:val="20"/>
+              </w:rPr>
+              <w:t xml:space="preserve">Document Intelligence (free tier) for PDF extraction.</w:t>
+            </w:r>
+          </w:p>
+        </w:tc>
+      </w:tr>
+      <w:tr>
+        <w:tc>
+          <w:tcPr>
+            <w:tcW w:type="dxa" w:w="3600"/>
+            <w:tcBorders>
+              <w:top w:val="single" w:color="BBBBBB" w:sz="1"/>
+              <w:left w:val="single" w:color="BBBBBB" w:sz="1"/>
+              <w:bottom w:val="single" w:color="BBBBBB" w:sz="1"/>
+              <w:right w:val="single" w:color="BBBBBB" w:sz="1"/>
+            </w:tcBorders>
+            <w:tcMar>
+              <w:top w:type="dxa" w:w="80"/>
+              <w:left w:type="dxa" w:w="120"/>
+              <w:bottom w:type="dxa" w:w="80"/>
+              <w:right w:type="dxa" w:w="120"/>
+            </w:tcMar>
+          </w:tcPr>
+          <w:p>
+            <w:r>
+              <w:rPr>
+                <w:sz w:val="20"/>
+                <w:szCs w:val="20"/>
+              </w:rPr>
+              <w:t xml:space="preserve">evals/corpus/ (7 fixtures)</w:t>
+            </w:r>
+          </w:p>
+        </w:tc>
+        <w:tc>
+          <w:tcPr>
+            <w:tcW w:type="dxa" w:w="5760"/>
+            <w:tcBorders>
+              <w:top w:val="single" w:color="BBBBBB" w:sz="1"/>
+              <w:left w:val="single" w:color="BBBBBB" w:sz="1"/>
+              <w:bottom w:val="single" w:color="BBBBBB" w:sz="1"/>
+              <w:right w:val="single" w:color="BBBBBB" w:sz="1"/>
+            </w:tcBorders>
+            <w:tcMar>
+              <w:top w:type="dxa" w:w="80"/>
+              <w:left w:type="dxa" w:w="120"/>
+              <w:bottom w:type="dxa" w:w="80"/>
+              <w:right w:type="dxa" w:w="120"/>
+            </w:tcMar>
+          </w:tcPr>
+          <w:p>
+            <w:r>
+              <w:rPr>
+                <w:sz w:val="20"/>
+                <w:szCs w:val="20"/>
+              </w:rPr>
+              <w:t xml:space="preserve">The golden-question corpus: five public-docs fixtures plus two planted restricted documents (tenant-isolation and per-user tests).</w:t>
+            </w:r>
+          </w:p>
+        </w:tc>
+      </w:tr>
+    </w:tbl>
+    <w:p>
+      <w:pPr>
+        <w:pStyle w:val="Heading2"/>
+      </w:pPr>
+      <w:r>
+        <w:t xml:space="preserve">6.8 Automation, evals, docs, scripts</w:t>
       </w:r>
     </w:p>
     <w:tbl>
@@ -7381,6 +8225,276 @@
           </w:p>
         </w:tc>
       </w:tr>
+      <w:tr>
+        <w:tc>
+          <w:tcPr>
+            <w:tcW w:type="dxa" w:w="2000"/>
+            <w:tcBorders>
+              <w:top w:val="single" w:color="BBBBBB" w:sz="1"/>
+              <w:left w:val="single" w:color="BBBBBB" w:sz="1"/>
+              <w:bottom w:val="single" w:color="BBBBBB" w:sz="1"/>
+              <w:right w:val="single" w:color="BBBBBB" w:sz="1"/>
+            </w:tcBorders>
+            <w:tcMar>
+              <w:top w:type="dxa" w:w="80"/>
+              <w:left w:type="dxa" w:w="120"/>
+              <w:bottom w:type="dxa" w:w="80"/>
+              <w:right w:type="dxa" w:w="120"/>
+            </w:tcMar>
+          </w:tcPr>
+          <w:p>
+            <w:r>
+              <w:rPr>
+                <w:sz w:val="20"/>
+                <w:szCs w:val="20"/>
+              </w:rPr>
+              <w:t xml:space="preserve">d445226</w:t>
+            </w:r>
+          </w:p>
+        </w:tc>
+        <w:tc>
+          <w:tcPr>
+            <w:tcW w:type="dxa" w:w="7360"/>
+            <w:tcBorders>
+              <w:top w:val="single" w:color="BBBBBB" w:sz="1"/>
+              <w:left w:val="single" w:color="BBBBBB" w:sz="1"/>
+              <w:bottom w:val="single" w:color="BBBBBB" w:sz="1"/>
+              <w:right w:val="single" w:color="BBBBBB" w:sz="1"/>
+            </w:tcBorders>
+            <w:tcMar>
+              <w:top w:type="dxa" w:w="80"/>
+              <w:left w:type="dxa" w:w="120"/>
+              <w:bottom w:type="dxa" w:w="80"/>
+              <w:right w:type="dxa" w:w="120"/>
+            </w:tcMar>
+          </w:tcPr>
+          <w:p>
+            <w:r>
+              <w:rPr>
+                <w:sz w:val="20"/>
+                <w:szCs w:val="20"/>
+              </w:rPr>
+              <w:t xml:space="preserve">Phase 2 core: Query + Answer services and the chat page — streamed, cited, grounded answers with verified refusal behavior.</w:t>
+            </w:r>
+          </w:p>
+        </w:tc>
+      </w:tr>
+      <w:tr>
+        <w:tc>
+          <w:tcPr>
+            <w:tcW w:type="dxa" w:w="2000"/>
+            <w:tcBorders>
+              <w:top w:val="single" w:color="BBBBBB" w:sz="1"/>
+              <w:left w:val="single" w:color="BBBBBB" w:sz="1"/>
+              <w:bottom w:val="single" w:color="BBBBBB" w:sz="1"/>
+              <w:right w:val="single" w:color="BBBBBB" w:sz="1"/>
+            </w:tcBorders>
+            <w:tcMar>
+              <w:top w:type="dxa" w:w="80"/>
+              <w:left w:type="dxa" w:w="120"/>
+              <w:bottom w:type="dxa" w:w="80"/>
+              <w:right w:type="dxa" w:w="120"/>
+            </w:tcMar>
+          </w:tcPr>
+          <w:p>
+            <w:r>
+              <w:rPr>
+                <w:sz w:val="20"/>
+                <w:szCs w:val="20"/>
+              </w:rPr>
+              <w:t xml:space="preserve">530c154</w:t>
+            </w:r>
+          </w:p>
+        </w:tc>
+        <w:tc>
+          <w:tcPr>
+            <w:tcW w:type="dxa" w:w="7360"/>
+            <w:tcBorders>
+              <w:top w:val="single" w:color="BBBBBB" w:sz="1"/>
+              <w:left w:val="single" w:color="BBBBBB" w:sz="1"/>
+              <w:bottom w:val="single" w:color="BBBBBB" w:sz="1"/>
+              <w:right w:val="single" w:color="BBBBBB" w:sz="1"/>
+            </w:tcBorders>
+            <w:tcMar>
+              <w:top w:type="dxa" w:w="80"/>
+              <w:left w:type="dxa" w:w="120"/>
+              <w:bottom w:type="dxa" w:w="80"/>
+              <w:right w:type="dxa" w:w="120"/>
+            </w:tcMar>
+          </w:tcPr>
+          <w:p>
+            <w:r>
+              <w:rPr>
+                <w:sz w:val="20"/>
+                <w:szCs w:val="20"/>
+              </w:rPr>
+              <w:t xml:space="preserve">Phase 4 core: the eval harness with a perfect 10-question baseline (security 100%, hit-rate 100%, MRR 1.0).</w:t>
+            </w:r>
+          </w:p>
+        </w:tc>
+      </w:tr>
+      <w:tr>
+        <w:tc>
+          <w:tcPr>
+            <w:tcW w:type="dxa" w:w="2000"/>
+            <w:tcBorders>
+              <w:top w:val="single" w:color="BBBBBB" w:sz="1"/>
+              <w:left w:val="single" w:color="BBBBBB" w:sz="1"/>
+              <w:bottom w:val="single" w:color="BBBBBB" w:sz="1"/>
+              <w:right w:val="single" w:color="BBBBBB" w:sz="1"/>
+            </w:tcBorders>
+            <w:tcMar>
+              <w:top w:type="dxa" w:w="80"/>
+              <w:left w:type="dxa" w:w="120"/>
+              <w:bottom w:type="dxa" w:w="80"/>
+              <w:right w:type="dxa" w:w="120"/>
+            </w:tcMar>
+          </w:tcPr>
+          <w:p>
+            <w:r>
+              <w:rPr>
+                <w:sz w:val="20"/>
+                <w:szCs w:val="20"/>
+              </w:rPr>
+              <w:t xml:space="preserve">d65d39d</w:t>
+            </w:r>
+          </w:p>
+        </w:tc>
+        <w:tc>
+          <w:tcPr>
+            <w:tcW w:type="dxa" w:w="7360"/>
+            <w:tcBorders>
+              <w:top w:val="single" w:color="BBBBBB" w:sz="1"/>
+              <w:left w:val="single" w:color="BBBBBB" w:sz="1"/>
+              <w:bottom w:val="single" w:color="BBBBBB" w:sz="1"/>
+              <w:right w:val="single" w:color="BBBBBB" w:sz="1"/>
+            </w:tcBorders>
+            <w:tcMar>
+              <w:top w:type="dxa" w:w="80"/>
+              <w:left w:type="dxa" w:w="120"/>
+              <w:bottom w:type="dxa" w:w="80"/>
+              <w:right w:type="dxa" w:w="120"/>
+            </w:tcMar>
+          </w:tcPr>
+          <w:p>
+            <w:r>
+              <w:rPr>
+                <w:sz w:val="20"/>
+                <w:szCs w:val="20"/>
+              </w:rPr>
+              <w:t xml:space="preserve">Phase 3 core: per-user security trimming — same tenant, same question, provably different answers for alice and mallory. 11-question eval all perfect.</w:t>
+            </w:r>
+          </w:p>
+        </w:tc>
+      </w:tr>
+      <w:tr>
+        <w:tc>
+          <w:tcPr>
+            <w:tcW w:type="dxa" w:w="2000"/>
+            <w:tcBorders>
+              <w:top w:val="single" w:color="BBBBBB" w:sz="1"/>
+              <w:left w:val="single" w:color="BBBBBB" w:sz="1"/>
+              <w:bottom w:val="single" w:color="BBBBBB" w:sz="1"/>
+              <w:right w:val="single" w:color="BBBBBB" w:sz="1"/>
+            </w:tcBorders>
+            <w:tcMar>
+              <w:top w:type="dxa" w:w="80"/>
+              <w:left w:type="dxa" w:w="120"/>
+              <w:bottom w:type="dxa" w:w="80"/>
+              <w:right w:type="dxa" w:w="120"/>
+            </w:tcMar>
+          </w:tcPr>
+          <w:p>
+            <w:r>
+              <w:rPr>
+                <w:sz w:val="20"/>
+                <w:szCs w:val="20"/>
+              </w:rPr>
+              <w:t xml:space="preserve">e515301</w:t>
+            </w:r>
+          </w:p>
+        </w:tc>
+        <w:tc>
+          <w:tcPr>
+            <w:tcW w:type="dxa" w:w="7360"/>
+            <w:tcBorders>
+              <w:top w:val="single" w:color="BBBBBB" w:sz="1"/>
+              <w:left w:val="single" w:color="BBBBBB" w:sz="1"/>
+              <w:bottom w:val="single" w:color="BBBBBB" w:sz="1"/>
+              <w:right w:val="single" w:color="BBBBBB" w:sz="1"/>
+            </w:tcBorders>
+            <w:tcMar>
+              <w:top w:type="dxa" w:w="80"/>
+              <w:left w:type="dxa" w:w="120"/>
+              <w:bottom w:type="dxa" w:w="80"/>
+              <w:right w:type="dxa" w:w="120"/>
+            </w:tcMar>
+          </w:tcPr>
+          <w:p>
+            <w:r>
+              <w:rPr>
+                <w:sz w:val="20"/>
+                <w:szCs w:val="20"/>
+              </w:rPr>
+              <w:t xml:space="preserve">Phase 1 complete: PDF extraction via Document Intelligence, Event Grid mapping, durable idempotency, DLQ replay tool.</w:t>
+            </w:r>
+          </w:p>
+        </w:tc>
+      </w:tr>
+      <w:tr>
+        <w:tc>
+          <w:tcPr>
+            <w:tcW w:type="dxa" w:w="2000"/>
+            <w:tcBorders>
+              <w:top w:val="single" w:color="BBBBBB" w:sz="1"/>
+              <w:left w:val="single" w:color="BBBBBB" w:sz="1"/>
+              <w:bottom w:val="single" w:color="BBBBBB" w:sz="1"/>
+              <w:right w:val="single" w:color="BBBBBB" w:sz="1"/>
+            </w:tcBorders>
+            <w:tcMar>
+              <w:top w:type="dxa" w:w="80"/>
+              <w:left w:type="dxa" w:w="120"/>
+              <w:bottom w:type="dxa" w:w="80"/>
+              <w:right w:type="dxa" w:w="120"/>
+            </w:tcMar>
+          </w:tcPr>
+          <w:p>
+            <w:r>
+              <w:rPr>
+                <w:sz w:val="20"/>
+                <w:szCs w:val="20"/>
+              </w:rPr>
+              <w:t xml:space="preserve">63fa372</w:t>
+            </w:r>
+          </w:p>
+        </w:tc>
+        <w:tc>
+          <w:tcPr>
+            <w:tcW w:type="dxa" w:w="7360"/>
+            <w:tcBorders>
+              <w:top w:val="single" w:color="BBBBBB" w:sz="1"/>
+              <w:left w:val="single" w:color="BBBBBB" w:sz="1"/>
+              <w:bottom w:val="single" w:color="BBBBBB" w:sz="1"/>
+              <w:right w:val="single" w:color="BBBBBB" w:sz="1"/>
+            </w:tcBorders>
+            <w:tcMar>
+              <w:top w:type="dxa" w:w="80"/>
+              <w:left w:type="dxa" w:w="120"/>
+              <w:bottom w:type="dxa" w:w="80"/>
+              <w:right w:type="dxa" w:w="120"/>
+            </w:tcMar>
+          </w:tcPr>
+          <w:p>
+            <w:r>
+              <w:rPr>
+                <w:sz w:val="20"/>
+                <w:szCs w:val="20"/>
+              </w:rPr>
+              <w:t xml:space="preserve">Phase 5 core: connector sync engine — add/edit/delete lifecycle proven, deletions tombstone chunks out of the index.</w:t>
+            </w:r>
+          </w:p>
+        </w:tc>
+      </w:tr>
     </w:tbl>
     <w:p>
       <w:r>
@@ -8726,6 +9840,95 @@
           </w:p>
         </w:tc>
       </w:tr>
+      <w:tr>
+        <w:tc>
+          <w:tcPr>
+            <w:tcW w:type="dxa" w:w="2300"/>
+            <w:tcBorders>
+              <w:top w:val="single" w:color="BBBBBB" w:sz="1"/>
+              <w:left w:val="single" w:color="BBBBBB" w:sz="1"/>
+              <w:bottom w:val="single" w:color="BBBBBB" w:sz="1"/>
+              <w:right w:val="single" w:color="BBBBBB" w:sz="1"/>
+            </w:tcBorders>
+            <w:tcMar>
+              <w:top w:type="dxa" w:w="80"/>
+              <w:left w:type="dxa" w:w="120"/>
+              <w:bottom w:type="dxa" w:w="80"/>
+              <w:right w:type="dxa" w:w="120"/>
+            </w:tcMar>
+          </w:tcPr>
+          <w:p>
+            <w:r>
+              <w:rPr>
+                <w:sz w:val="20"/>
+                <w:szCs w:val="20"/>
+              </w:rPr>
+              <w:t xml:space="preserve">Document Intelligence</w:t>
+            </w:r>
+          </w:p>
+        </w:tc>
+        <w:tc>
+          <w:tcPr>
+            <w:tcW w:type="dxa" w:w="4560"/>
+            <w:tcBorders>
+              <w:top w:val="single" w:color="BBBBBB" w:sz="1"/>
+              <w:left w:val="single" w:color="BBBBBB" w:sz="1"/>
+              <w:bottom w:val="single" w:color="BBBBBB" w:sz="1"/>
+              <w:right w:val="single" w:color="BBBBBB" w:sz="1"/>
+            </w:tcBorders>
+            <w:tcMar>
+              <w:top w:type="dxa" w:w="80"/>
+              <w:left w:type="dxa" w:w="120"/>
+              <w:bottom w:type="dxa" w:w="80"/>
+              <w:right w:type="dxa" w:w="120"/>
+            </w:tcMar>
+          </w:tcPr>
+          <w:p>
+            <w:r>
+              <w:rPr>
+                <w:sz w:val="20"/>
+                <w:szCs w:val="20"/>
+              </w:rPr>
+              <w:t xml:space="preserve">Reads PDFs and scans: layout analysis turns them into structured markdown (headings, tables) that flows through the normal parsing path. Free tier: 500 pages/month.</w:t>
+            </w:r>
+          </w:p>
+        </w:tc>
+        <w:tc>
+          <w:tcPr>
+            <w:tcW w:type="dxa" w:w="2500"/>
+            <w:tcBorders>
+              <w:top w:val="single" w:color="BBBBBB" w:sz="1"/>
+              <w:left w:val="single" w:color="BBBBBB" w:sz="1"/>
+              <w:bottom w:val="single" w:color="BBBBBB" w:sz="1"/>
+              <w:right w:val="single" w:color="BBBBBB" w:sz="1"/>
+            </w:tcBorders>
+            <w:tcMar>
+              <w:top w:type="dxa" w:w="80"/>
+              <w:left w:type="dxa" w:w="120"/>
+              <w:bottom w:type="dxa" w:w="80"/>
+              <w:right w:type="dxa" w:w="120"/>
+            </w:tcMar>
+          </w:tcPr>
+          <w:p>
+            <w:r>
+              <w:rPr>
+                <w:sz w:val="20"/>
+                <w:szCs w:val="20"/>
+              </w:rPr>
+              <w:t xml:space="preserve">Live</w:t>
+            </w:r>
+          </w:p>
+          <w:p>
+            <w:r>
+              <w:rPr>
+                <w:sz w:val="20"/>
+                <w:szCs w:val="20"/>
+              </w:rPr>
+              <w:t xml:space="preserve">di-knowvault-dev-…</w:t>
+            </w:r>
+          </w:p>
+        </w:tc>
+      </w:tr>
     </w:tbl>
     <w:p>
       <w:pPr>
@@ -9984,7 +11187,7 @@
                 <w:sz w:val="20"/>
                 <w:szCs w:val="20"/>
               </w:rPr>
-              <w:t xml:space="preserve">≈85%</w:t>
+              <w:t xml:space="preserve">Complete</w:t>
             </w:r>
           </w:p>
         </w:tc>
@@ -10010,7 +11213,7 @@
                 <w:sz w:val="20"/>
                 <w:szCs w:val="20"/>
               </w:rPr>
-              <w:t xml:space="preserve">Full pipeline proven against real Azure on 9 July: uploaded document → 4 chunks embedded with text-embedding-3-large → indexed in AI Search + Cosmos; both keyword search and pure meaning-based (vector) search return the correct chunks. Remaining: PDF support, Event Grid message mapping, durable duplicate-ledger in SQL, dead-letter replay tool.</w:t>
+              <w:t xml:space="preserve">Markdown, text, and PDF (Document Intelligence) all proven end-to-end; Event Grid mapping; durable duplicate detection; dead-letter replay tool.</w:t>
             </w:r>
           </w:p>
         </w:tc>
@@ -10064,6 +11267,326 @@
                 <w:sz w:val="20"/>
                 <w:szCs w:val="20"/>
               </w:rPr>
+              <w:t xml:space="preserve">Core done</w:t>
+            </w:r>
+          </w:p>
+        </w:tc>
+        <w:tc>
+          <w:tcPr>
+            <w:tcW w:type="dxa" w:w="4960"/>
+            <w:tcBorders>
+              <w:top w:val="single" w:color="BBBBBB" w:sz="1"/>
+              <w:left w:val="single" w:color="BBBBBB" w:sz="1"/>
+              <w:bottom w:val="single" w:color="BBBBBB" w:sz="1"/>
+              <w:right w:val="single" w:color="BBBBBB" w:sz="1"/>
+            </w:tcBorders>
+            <w:tcMar>
+              <w:top w:type="dxa" w:w="80"/>
+              <w:left w:type="dxa" w:w="120"/>
+              <w:bottom w:type="dxa" w:w="80"/>
+              <w:right w:type="dxa" w:w="120"/>
+            </w:tcMar>
+          </w:tcPr>
+          <w:p>
+            <w:r>
+              <w:rPr>
+                <w:sz w:val="20"/>
+                <w:szCs w:val="20"/>
+              </w:rPr>
+              <w:t xml:space="preserve">Hybrid search, grounded streamed answers with citations and verified refusals, chat page with user switcher. Polish remaining: semantic cache, query rewriting from chat history, neighbor-chunk expansion.</w:t>
+            </w:r>
+          </w:p>
+        </w:tc>
+      </w:tr>
+      <w:tr>
+        <w:tc>
+          <w:tcPr>
+            <w:tcW w:type="dxa" w:w="2600"/>
+            <w:tcBorders>
+              <w:top w:val="single" w:color="BBBBBB" w:sz="1"/>
+              <w:left w:val="single" w:color="BBBBBB" w:sz="1"/>
+              <w:bottom w:val="single" w:color="BBBBBB" w:sz="1"/>
+              <w:right w:val="single" w:color="BBBBBB" w:sz="1"/>
+            </w:tcBorders>
+            <w:tcMar>
+              <w:top w:type="dxa" w:w="80"/>
+              <w:left w:type="dxa" w:w="120"/>
+              <w:bottom w:type="dxa" w:w="80"/>
+              <w:right w:type="dxa" w:w="120"/>
+            </w:tcMar>
+          </w:tcPr>
+          <w:p>
+            <w:r>
+              <w:rPr>
+                <w:sz w:val="20"/>
+                <w:szCs w:val="20"/>
+              </w:rPr>
+              <w:t xml:space="preserve">Phase 3 — Multi-tenancy + security trimming</w:t>
+            </w:r>
+          </w:p>
+        </w:tc>
+        <w:tc>
+          <w:tcPr>
+            <w:tcW w:type="dxa" w:w="1800"/>
+            <w:tcBorders>
+              <w:top w:val="single" w:color="BBBBBB" w:sz="1"/>
+              <w:left w:val="single" w:color="BBBBBB" w:sz="1"/>
+              <w:bottom w:val="single" w:color="BBBBBB" w:sz="1"/>
+              <w:right w:val="single" w:color="BBBBBB" w:sz="1"/>
+            </w:tcBorders>
+            <w:tcMar>
+              <w:top w:type="dxa" w:w="80"/>
+              <w:left w:type="dxa" w:w="120"/>
+              <w:bottom w:type="dxa" w:w="80"/>
+              <w:right w:type="dxa" w:w="120"/>
+            </w:tcMar>
+          </w:tcPr>
+          <w:p>
+            <w:r>
+              <w:rPr>
+                <w:sz w:val="20"/>
+                <w:szCs w:val="20"/>
+              </w:rPr>
+              <w:t xml:space="preserve">Core done</w:t>
+            </w:r>
+          </w:p>
+        </w:tc>
+        <w:tc>
+          <w:tcPr>
+            <w:tcW w:type="dxa" w:w="4960"/>
+            <w:tcBorders>
+              <w:top w:val="single" w:color="BBBBBB" w:sz="1"/>
+              <w:left w:val="single" w:color="BBBBBB" w:sz="1"/>
+              <w:bottom w:val="single" w:color="BBBBBB" w:sz="1"/>
+              <w:right w:val="single" w:color="BBBBBB" w:sz="1"/>
+            </w:tcBorders>
+            <w:tcMar>
+              <w:top w:type="dxa" w:w="80"/>
+              <w:left w:type="dxa" w:w="120"/>
+              <w:bottom w:type="dxa" w:w="80"/>
+              <w:right w:type="dxa" w:w="120"/>
+            </w:tcMar>
+          </w:tcPr>
+          <w:p>
+            <w:r>
+              <w:rPr>
+                <w:sz w:val="20"/>
+                <w:szCs w:val="20"/>
+              </w:rPr>
+              <w:t xml:space="preserve">Per-user security trimming proven: same tenant, same question, different answers for authorized vs unauthorized users. Remaining: real Entra ID sign-in replacing the dev test users (needs interactive setup).</w:t>
+            </w:r>
+          </w:p>
+        </w:tc>
+      </w:tr>
+      <w:tr>
+        <w:tc>
+          <w:tcPr>
+            <w:tcW w:type="dxa" w:w="2600"/>
+            <w:tcBorders>
+              <w:top w:val="single" w:color="BBBBBB" w:sz="1"/>
+              <w:left w:val="single" w:color="BBBBBB" w:sz="1"/>
+              <w:bottom w:val="single" w:color="BBBBBB" w:sz="1"/>
+              <w:right w:val="single" w:color="BBBBBB" w:sz="1"/>
+            </w:tcBorders>
+            <w:tcMar>
+              <w:top w:type="dxa" w:w="80"/>
+              <w:left w:type="dxa" w:w="120"/>
+              <w:bottom w:type="dxa" w:w="80"/>
+              <w:right w:type="dxa" w:w="120"/>
+            </w:tcMar>
+          </w:tcPr>
+          <w:p>
+            <w:r>
+              <w:rPr>
+                <w:sz w:val="20"/>
+                <w:szCs w:val="20"/>
+              </w:rPr>
+              <w:t xml:space="preserve">Phase 4 — Eval harness + CI gates</w:t>
+            </w:r>
+          </w:p>
+        </w:tc>
+        <w:tc>
+          <w:tcPr>
+            <w:tcW w:type="dxa" w:w="1800"/>
+            <w:tcBorders>
+              <w:top w:val="single" w:color="BBBBBB" w:sz="1"/>
+              <w:left w:val="single" w:color="BBBBBB" w:sz="1"/>
+              <w:bottom w:val="single" w:color="BBBBBB" w:sz="1"/>
+              <w:right w:val="single" w:color="BBBBBB" w:sz="1"/>
+            </w:tcBorders>
+            <w:tcMar>
+              <w:top w:type="dxa" w:w="80"/>
+              <w:left w:type="dxa" w:w="120"/>
+              <w:bottom w:type="dxa" w:w="80"/>
+              <w:right w:type="dxa" w:w="120"/>
+            </w:tcMar>
+          </w:tcPr>
+          <w:p>
+            <w:r>
+              <w:rPr>
+                <w:sz w:val="20"/>
+                <w:szCs w:val="20"/>
+              </w:rPr>
+              <w:t xml:space="preserve">Core done</w:t>
+            </w:r>
+          </w:p>
+        </w:tc>
+        <w:tc>
+          <w:tcPr>
+            <w:tcW w:type="dxa" w:w="4960"/>
+            <w:tcBorders>
+              <w:top w:val="single" w:color="BBBBBB" w:sz="1"/>
+              <w:left w:val="single" w:color="BBBBBB" w:sz="1"/>
+              <w:bottom w:val="single" w:color="BBBBBB" w:sz="1"/>
+              <w:right w:val="single" w:color="BBBBBB" w:sz="1"/>
+            </w:tcBorders>
+            <w:tcMar>
+              <w:top w:type="dxa" w:w="80"/>
+              <w:left w:type="dxa" w:w="120"/>
+              <w:bottom w:type="dxa" w:w="80"/>
+              <w:right w:type="dxa" w:w="120"/>
+            </w:tcMar>
+          </w:tcPr>
+          <w:p>
+            <w:r>
+              <w:rPr>
+                <w:sz w:val="20"/>
+                <w:szCs w:val="20"/>
+              </w:rPr>
+              <w:t xml:space="preserve">11-question suite with LLM judge; every run so far perfect, security always 100%. Remaining: automatic CI gating (needs GitHub-to-Azure credential setup).</w:t>
+            </w:r>
+          </w:p>
+        </w:tc>
+      </w:tr>
+      <w:tr>
+        <w:tc>
+          <w:tcPr>
+            <w:tcW w:type="dxa" w:w="2600"/>
+            <w:tcBorders>
+              <w:top w:val="single" w:color="BBBBBB" w:sz="1"/>
+              <w:left w:val="single" w:color="BBBBBB" w:sz="1"/>
+              <w:bottom w:val="single" w:color="BBBBBB" w:sz="1"/>
+              <w:right w:val="single" w:color="BBBBBB" w:sz="1"/>
+            </w:tcBorders>
+            <w:tcMar>
+              <w:top w:type="dxa" w:w="80"/>
+              <w:left w:type="dxa" w:w="120"/>
+              <w:bottom w:type="dxa" w:w="80"/>
+              <w:right w:type="dxa" w:w="120"/>
+            </w:tcMar>
+          </w:tcPr>
+          <w:p>
+            <w:r>
+              <w:rPr>
+                <w:sz w:val="20"/>
+                <w:szCs w:val="20"/>
+              </w:rPr>
+              <w:t xml:space="preserve">Phase 5 — Connector + polish</w:t>
+            </w:r>
+          </w:p>
+        </w:tc>
+        <w:tc>
+          <w:tcPr>
+            <w:tcW w:type="dxa" w:w="1800"/>
+            <w:tcBorders>
+              <w:top w:val="single" w:color="BBBBBB" w:sz="1"/>
+              <w:left w:val="single" w:color="BBBBBB" w:sz="1"/>
+              <w:bottom w:val="single" w:color="BBBBBB" w:sz="1"/>
+              <w:right w:val="single" w:color="BBBBBB" w:sz="1"/>
+            </w:tcBorders>
+            <w:tcMar>
+              <w:top w:type="dxa" w:w="80"/>
+              <w:left w:type="dxa" w:w="120"/>
+              <w:bottom w:type="dxa" w:w="80"/>
+              <w:right w:type="dxa" w:w="120"/>
+            </w:tcMar>
+          </w:tcPr>
+          <w:p>
+            <w:r>
+              <w:rPr>
+                <w:sz w:val="20"/>
+                <w:szCs w:val="20"/>
+              </w:rPr>
+              <w:t xml:space="preserve">Core done</w:t>
+            </w:r>
+          </w:p>
+        </w:tc>
+        <w:tc>
+          <w:tcPr>
+            <w:tcW w:type="dxa" w:w="4960"/>
+            <w:tcBorders>
+              <w:top w:val="single" w:color="BBBBBB" w:sz="1"/>
+              <w:left w:val="single" w:color="BBBBBB" w:sz="1"/>
+              <w:bottom w:val="single" w:color="BBBBBB" w:sz="1"/>
+              <w:right w:val="single" w:color="BBBBBB" w:sz="1"/>
+            </w:tcBorders>
+            <w:tcMar>
+              <w:top w:type="dxa" w:w="80"/>
+              <w:left w:type="dxa" w:w="120"/>
+              <w:bottom w:type="dxa" w:w="80"/>
+              <w:right w:type="dxa" w:w="120"/>
+            </w:tcMar>
+          </w:tcPr>
+          <w:p>
+            <w:r>
+              <w:rPr>
+                <w:sz w:val="20"/>
+                <w:szCs w:val="20"/>
+              </w:rPr>
+              <w:t xml:space="preserve">Sync engine with full add/edit/delete lifecycle proven via the local-folder connector; SharePoint is an adapter over the same interface once an M365 tenant is available. Remaining: semantic cache, cost dashboard.</w:t>
+            </w:r>
+          </w:p>
+        </w:tc>
+      </w:tr>
+      <w:tr>
+        <w:tc>
+          <w:tcPr>
+            <w:tcW w:type="dxa" w:w="2600"/>
+            <w:tcBorders>
+              <w:top w:val="single" w:color="BBBBBB" w:sz="1"/>
+              <w:left w:val="single" w:color="BBBBBB" w:sz="1"/>
+              <w:bottom w:val="single" w:color="BBBBBB" w:sz="1"/>
+              <w:right w:val="single" w:color="BBBBBB" w:sz="1"/>
+            </w:tcBorders>
+            <w:tcMar>
+              <w:top w:type="dxa" w:w="80"/>
+              <w:left w:type="dxa" w:w="120"/>
+              <w:bottom w:type="dxa" w:w="80"/>
+              <w:right w:type="dxa" w:w="120"/>
+            </w:tcMar>
+          </w:tcPr>
+          <w:p>
+            <w:r>
+              <w:rPr>
+                <w:sz w:val="20"/>
+                <w:szCs w:val="20"/>
+              </w:rPr>
+              <w:t xml:space="preserve">Phase 6 — Production posture + demo</w:t>
+            </w:r>
+          </w:p>
+        </w:tc>
+        <w:tc>
+          <w:tcPr>
+            <w:tcW w:type="dxa" w:w="1800"/>
+            <w:tcBorders>
+              <w:top w:val="single" w:color="BBBBBB" w:sz="1"/>
+              <w:left w:val="single" w:color="BBBBBB" w:sz="1"/>
+              <w:bottom w:val="single" w:color="BBBBBB" w:sz="1"/>
+              <w:right w:val="single" w:color="BBBBBB" w:sz="1"/>
+            </w:tcBorders>
+            <w:tcMar>
+              <w:top w:type="dxa" w:w="80"/>
+              <w:left w:type="dxa" w:w="120"/>
+              <w:bottom w:type="dxa" w:w="80"/>
+              <w:right w:type="dxa" w:w="120"/>
+            </w:tcMar>
+          </w:tcPr>
+          <w:p>
+            <w:r>
+              <w:rPr>
+                <w:sz w:val="20"/>
+                <w:szCs w:val="20"/>
+              </w:rPr>
               <w:t xml:space="preserve">Not started</w:t>
             </w:r>
           </w:p>
@@ -10090,327 +11613,7 @@
                 <w:sz w:val="20"/>
                 <w:szCs w:val="20"/>
               </w:rPr>
-              <w:t xml:space="preserve">Hybrid search, grounded streaming answers with citations, minimal chat page.</w:t>
-            </w:r>
-          </w:p>
-        </w:tc>
-      </w:tr>
-      <w:tr>
-        <w:tc>
-          <w:tcPr>
-            <w:tcW w:type="dxa" w:w="2600"/>
-            <w:tcBorders>
-              <w:top w:val="single" w:color="BBBBBB" w:sz="1"/>
-              <w:left w:val="single" w:color="BBBBBB" w:sz="1"/>
-              <w:bottom w:val="single" w:color="BBBBBB" w:sz="1"/>
-              <w:right w:val="single" w:color="BBBBBB" w:sz="1"/>
-            </w:tcBorders>
-            <w:tcMar>
-              <w:top w:type="dxa" w:w="80"/>
-              <w:left w:type="dxa" w:w="120"/>
-              <w:bottom w:type="dxa" w:w="80"/>
-              <w:right w:type="dxa" w:w="120"/>
-            </w:tcMar>
-          </w:tcPr>
-          <w:p>
-            <w:r>
-              <w:rPr>
-                <w:sz w:val="20"/>
-                <w:szCs w:val="20"/>
-              </w:rPr>
-              <w:t xml:space="preserve">Phase 3 — Multi-tenancy + security trimming</w:t>
-            </w:r>
-          </w:p>
-        </w:tc>
-        <w:tc>
-          <w:tcPr>
-            <w:tcW w:type="dxa" w:w="1800"/>
-            <w:tcBorders>
-              <w:top w:val="single" w:color="BBBBBB" w:sz="1"/>
-              <w:left w:val="single" w:color="BBBBBB" w:sz="1"/>
-              <w:bottom w:val="single" w:color="BBBBBB" w:sz="1"/>
-              <w:right w:val="single" w:color="BBBBBB" w:sz="1"/>
-            </w:tcBorders>
-            <w:tcMar>
-              <w:top w:type="dxa" w:w="80"/>
-              <w:left w:type="dxa" w:w="120"/>
-              <w:bottom w:type="dxa" w:w="80"/>
-              <w:right w:type="dxa" w:w="120"/>
-            </w:tcMar>
-          </w:tcPr>
-          <w:p>
-            <w:r>
-              <w:rPr>
-                <w:sz w:val="20"/>
-                <w:szCs w:val="20"/>
-              </w:rPr>
-              <w:t xml:space="preserve">Not started</w:t>
-            </w:r>
-          </w:p>
-        </w:tc>
-        <w:tc>
-          <w:tcPr>
-            <w:tcW w:type="dxa" w:w="4960"/>
-            <w:tcBorders>
-              <w:top w:val="single" w:color="BBBBBB" w:sz="1"/>
-              <w:left w:val="single" w:color="BBBBBB" w:sz="1"/>
-              <w:bottom w:val="single" w:color="BBBBBB" w:sz="1"/>
-              <w:right w:val="single" w:color="BBBBBB" w:sz="1"/>
-            </w:tcBorders>
-            <w:tcMar>
-              <w:top w:type="dxa" w:w="80"/>
-              <w:left w:type="dxa" w:w="120"/>
-              <w:bottom w:type="dxa" w:w="80"/>
-              <w:right w:type="dxa" w:w="120"/>
-            </w:tcMar>
-          </w:tcPr>
-          <w:p>
-            <w:r>
-              <w:rPr>
-                <w:sz w:val="20"/>
-                <w:szCs w:val="20"/>
-              </w:rPr>
-              <w:t xml:space="preserve">Sign-in (Entra ID), the SecurityTrimmingService, the planted-secret-document tests.</w:t>
-            </w:r>
-          </w:p>
-        </w:tc>
-      </w:tr>
-      <w:tr>
-        <w:tc>
-          <w:tcPr>
-            <w:tcW w:type="dxa" w:w="2600"/>
-            <w:tcBorders>
-              <w:top w:val="single" w:color="BBBBBB" w:sz="1"/>
-              <w:left w:val="single" w:color="BBBBBB" w:sz="1"/>
-              <w:bottom w:val="single" w:color="BBBBBB" w:sz="1"/>
-              <w:right w:val="single" w:color="BBBBBB" w:sz="1"/>
-            </w:tcBorders>
-            <w:tcMar>
-              <w:top w:type="dxa" w:w="80"/>
-              <w:left w:type="dxa" w:w="120"/>
-              <w:bottom w:type="dxa" w:w="80"/>
-              <w:right w:type="dxa" w:w="120"/>
-            </w:tcMar>
-          </w:tcPr>
-          <w:p>
-            <w:r>
-              <w:rPr>
-                <w:sz w:val="20"/>
-                <w:szCs w:val="20"/>
-              </w:rPr>
-              <w:t xml:space="preserve">Phase 4 — Eval harness + CI gates</w:t>
-            </w:r>
-          </w:p>
-        </w:tc>
-        <w:tc>
-          <w:tcPr>
-            <w:tcW w:type="dxa" w:w="1800"/>
-            <w:tcBorders>
-              <w:top w:val="single" w:color="BBBBBB" w:sz="1"/>
-              <w:left w:val="single" w:color="BBBBBB" w:sz="1"/>
-              <w:bottom w:val="single" w:color="BBBBBB" w:sz="1"/>
-              <w:right w:val="single" w:color="BBBBBB" w:sz="1"/>
-            </w:tcBorders>
-            <w:tcMar>
-              <w:top w:type="dxa" w:w="80"/>
-              <w:left w:type="dxa" w:w="120"/>
-              <w:bottom w:type="dxa" w:w="80"/>
-              <w:right w:type="dxa" w:w="120"/>
-            </w:tcMar>
-          </w:tcPr>
-          <w:p>
-            <w:r>
-              <w:rPr>
-                <w:sz w:val="20"/>
-                <w:szCs w:val="20"/>
-              </w:rPr>
-              <w:t xml:space="preserve">Seeded</w:t>
-            </w:r>
-          </w:p>
-        </w:tc>
-        <w:tc>
-          <w:tcPr>
-            <w:tcW w:type="dxa" w:w="4960"/>
-            <w:tcBorders>
-              <w:top w:val="single" w:color="BBBBBB" w:sz="1"/>
-              <w:left w:val="single" w:color="BBBBBB" w:sz="1"/>
-              <w:bottom w:val="single" w:color="BBBBBB" w:sz="1"/>
-              <w:right w:val="single" w:color="BBBBBB" w:sz="1"/>
-            </w:tcBorders>
-            <w:tcMar>
-              <w:top w:type="dxa" w:w="80"/>
-              <w:left w:type="dxa" w:w="120"/>
-              <w:bottom w:type="dxa" w:w="80"/>
-              <w:right w:type="dxa" w:w="120"/>
-            </w:tcMar>
-          </w:tcPr>
-          <w:p>
-            <w:r>
-              <w:rPr>
-                <w:sz w:val="20"/>
-                <w:szCs w:val="20"/>
-              </w:rPr>
-              <w:t xml:space="preserve">10 golden questions written; harness and gates to come.</w:t>
-            </w:r>
-          </w:p>
-        </w:tc>
-      </w:tr>
-      <w:tr>
-        <w:tc>
-          <w:tcPr>
-            <w:tcW w:type="dxa" w:w="2600"/>
-            <w:tcBorders>
-              <w:top w:val="single" w:color="BBBBBB" w:sz="1"/>
-              <w:left w:val="single" w:color="BBBBBB" w:sz="1"/>
-              <w:bottom w:val="single" w:color="BBBBBB" w:sz="1"/>
-              <w:right w:val="single" w:color="BBBBBB" w:sz="1"/>
-            </w:tcBorders>
-            <w:tcMar>
-              <w:top w:type="dxa" w:w="80"/>
-              <w:left w:type="dxa" w:w="120"/>
-              <w:bottom w:type="dxa" w:w="80"/>
-              <w:right w:type="dxa" w:w="120"/>
-            </w:tcMar>
-          </w:tcPr>
-          <w:p>
-            <w:r>
-              <w:rPr>
-                <w:sz w:val="20"/>
-                <w:szCs w:val="20"/>
-              </w:rPr>
-              <w:t xml:space="preserve">Phase 5 — SharePoint connector + polish</w:t>
-            </w:r>
-          </w:p>
-        </w:tc>
-        <w:tc>
-          <w:tcPr>
-            <w:tcW w:type="dxa" w:w="1800"/>
-            <w:tcBorders>
-              <w:top w:val="single" w:color="BBBBBB" w:sz="1"/>
-              <w:left w:val="single" w:color="BBBBBB" w:sz="1"/>
-              <w:bottom w:val="single" w:color="BBBBBB" w:sz="1"/>
-              <w:right w:val="single" w:color="BBBBBB" w:sz="1"/>
-            </w:tcBorders>
-            <w:tcMar>
-              <w:top w:type="dxa" w:w="80"/>
-              <w:left w:type="dxa" w:w="120"/>
-              <w:bottom w:type="dxa" w:w="80"/>
-              <w:right w:type="dxa" w:w="120"/>
-            </w:tcMar>
-          </w:tcPr>
-          <w:p>
-            <w:r>
-              <w:rPr>
-                <w:sz w:val="20"/>
-                <w:szCs w:val="20"/>
-              </w:rPr>
-              <w:t xml:space="preserve">Not started</w:t>
-            </w:r>
-          </w:p>
-        </w:tc>
-        <w:tc>
-          <w:tcPr>
-            <w:tcW w:type="dxa" w:w="4960"/>
-            <w:tcBorders>
-              <w:top w:val="single" w:color="BBBBBB" w:sz="1"/>
-              <w:left w:val="single" w:color="BBBBBB" w:sz="1"/>
-              <w:bottom w:val="single" w:color="BBBBBB" w:sz="1"/>
-              <w:right w:val="single" w:color="BBBBBB" w:sz="1"/>
-            </w:tcBorders>
-            <w:tcMar>
-              <w:top w:type="dxa" w:w="80"/>
-              <w:left w:type="dxa" w:w="120"/>
-              <w:bottom w:type="dxa" w:w="80"/>
-              <w:right w:type="dxa" w:w="120"/>
-            </w:tcMar>
-          </w:tcPr>
-          <w:p>
-            <w:r>
-              <w:rPr>
-                <w:sz w:val="20"/>
-                <w:szCs w:val="20"/>
-              </w:rPr>
-              <w:t xml:space="preserve">Real connector, semantic cache, cost dashboard.</w:t>
-            </w:r>
-          </w:p>
-        </w:tc>
-      </w:tr>
-      <w:tr>
-        <w:tc>
-          <w:tcPr>
-            <w:tcW w:type="dxa" w:w="2600"/>
-            <w:tcBorders>
-              <w:top w:val="single" w:color="BBBBBB" w:sz="1"/>
-              <w:left w:val="single" w:color="BBBBBB" w:sz="1"/>
-              <w:bottom w:val="single" w:color="BBBBBB" w:sz="1"/>
-              <w:right w:val="single" w:color="BBBBBB" w:sz="1"/>
-            </w:tcBorders>
-            <w:tcMar>
-              <w:top w:type="dxa" w:w="80"/>
-              <w:left w:type="dxa" w:w="120"/>
-              <w:bottom w:type="dxa" w:w="80"/>
-              <w:right w:type="dxa" w:w="120"/>
-            </w:tcMar>
-          </w:tcPr>
-          <w:p>
-            <w:r>
-              <w:rPr>
-                <w:sz w:val="20"/>
-                <w:szCs w:val="20"/>
-              </w:rPr>
-              <w:t xml:space="preserve">Phase 6 — Production posture + demo</w:t>
-            </w:r>
-          </w:p>
-        </w:tc>
-        <w:tc>
-          <w:tcPr>
-            <w:tcW w:type="dxa" w:w="1800"/>
-            <w:tcBorders>
-              <w:top w:val="single" w:color="BBBBBB" w:sz="1"/>
-              <w:left w:val="single" w:color="BBBBBB" w:sz="1"/>
-              <w:bottom w:val="single" w:color="BBBBBB" w:sz="1"/>
-              <w:right w:val="single" w:color="BBBBBB" w:sz="1"/>
-            </w:tcBorders>
-            <w:tcMar>
-              <w:top w:type="dxa" w:w="80"/>
-              <w:left w:type="dxa" w:w="120"/>
-              <w:bottom w:type="dxa" w:w="80"/>
-              <w:right w:type="dxa" w:w="120"/>
-            </w:tcMar>
-          </w:tcPr>
-          <w:p>
-            <w:r>
-              <w:rPr>
-                <w:sz w:val="20"/>
-                <w:szCs w:val="20"/>
-              </w:rPr>
-              <w:t xml:space="preserve">Not started</w:t>
-            </w:r>
-          </w:p>
-        </w:tc>
-        <w:tc>
-          <w:tcPr>
-            <w:tcW w:type="dxa" w:w="4960"/>
-            <w:tcBorders>
-              <w:top w:val="single" w:color="BBBBBB" w:sz="1"/>
-              <w:left w:val="single" w:color="BBBBBB" w:sz="1"/>
-              <w:bottom w:val="single" w:color="BBBBBB" w:sz="1"/>
-              <w:right w:val="single" w:color="BBBBBB" w:sz="1"/>
-            </w:tcBorders>
-            <w:tcMar>
-              <w:top w:type="dxa" w:w="80"/>
-              <w:left w:type="dxa" w:w="120"/>
-              <w:bottom w:type="dxa" w:w="80"/>
-              <w:right w:type="dxa" w:w="120"/>
-            </w:tcMar>
-          </w:tcPr>
-          <w:p>
-            <w:r>
-              <w:rPr>
-                <w:sz w:val="20"/>
-                <w:szCs w:val="20"/>
-              </w:rPr>
-              <w:t xml:space="preserve">Private networking, rate limiting, load test, demo video.</w:t>
+              <w:t xml:space="preserve">Deploy the services into Container Apps, private networking, rate limiting, load test, demo video.</w:t>
             </w:r>
           </w:p>
         </w:tc>
@@ -10434,7 +11637,7 @@
         <w:spacing w:after="60"/>
       </w:pPr>
       <w:r>
-        <w:t xml:space="preserve">Begin Phase 2: the Query service — hybrid (keyword + vector) retrieval with the mandatory tenant and permission filters.</w:t>
+        <w:t xml:space="preserve">Usage metrics: measure tokens and cost per answer (success criterion 5 — cost visibility).</w:t>
       </w:r>
     </w:p>
     <w:p>
@@ -10447,7 +11650,7 @@
         <w:spacing w:after="60"/>
       </w:pPr>
       <w:r>
-        <w:t xml:space="preserve">The Answer service: grounded prompt to gpt-5-mini, streamed answers, [n] citations, and honest refusals.</w:t>
+        <w:t xml:space="preserve">Real Entra ID sign-in and GitHub-to-Azure credentials for CI gates (both need interactive setup with the owner).</w:t>
       </w:r>
     </w:p>
     <w:p>
@@ -10460,20 +11663,7 @@
         <w:spacing w:after="60"/>
       </w:pPr>
       <w:r>
-        <w:t xml:space="preserve">A minimal chat page for demos and day-to-day quality checking.</w:t>
-      </w:r>
-    </w:p>
-    <w:p>
-      <w:pPr>
-        <w:pStyle w:val="ListParagraph"/>
-        <w:numPr>
-          <w:ilvl w:val="0"/>
-          <w:numId w:val="7"/>
-        </w:numPr>
-        <w:spacing w:after="60"/>
-      </w:pPr>
-      <w:r>
-        <w:t xml:space="preserve">Round out Phase 1 in parallel: PDF extraction, Event Grid message mapping, durable duplicate-ledger, dead-letter replay tool.</w:t>
+        <w:t xml:space="preserve">Phase 6: package the seven services as containers and deploy them into the Container Apps environment, lighting up the App Insights dashboards.</w:t>
       </w:r>
     </w:p>
     <w:p>

</xml_diff>